<commit_message>
added theory for practice3
</commit_message>
<xml_diff>
--- a/practices/practice_2/report/report.docx
+++ b/practices/practice_2/report/report.docx
@@ -4,69 +4,525 @@
   <w:body>
     <w:p>
       <w:pPr>
-        <w:rPr>
-          <w:rFonts w:ascii="Times New Roman" w:hAnsi="Times New Roman" w:cs="Times New Roman"/>
-          <w:sz w:val="28"/>
-          <w:szCs w:val="28"/>
-        </w:rPr>
-      </w:pPr>
-      <w:r>
-        <w:rPr>
-          <w:rFonts w:ascii="Times New Roman" w:hAnsi="Times New Roman" w:cs="Times New Roman"/>
-          <w:sz w:val="28"/>
-          <w:szCs w:val="28"/>
-        </w:rPr>
-        <w:t>«Системное администрирование»</w:t>
-      </w:r>
-    </w:p>
-    <w:p>
-      <w:pPr>
-        <w:rPr>
-          <w:rFonts w:ascii="Times New Roman" w:hAnsi="Times New Roman" w:cs="Times New Roman"/>
-          <w:sz w:val="28"/>
-          <w:szCs w:val="28"/>
-        </w:rPr>
-      </w:pPr>
-      <w:r>
-        <w:rPr>
-          <w:rFonts w:ascii="Times New Roman" w:hAnsi="Times New Roman" w:cs="Times New Roman"/>
-          <w:sz w:val="28"/>
-          <w:szCs w:val="28"/>
-        </w:rPr>
-        <w:t>Отчёт по практике</w:t>
-      </w:r>
-      <w:r>
-        <w:rPr>
-          <w:rFonts w:ascii="Times New Roman" w:hAnsi="Times New Roman" w:cs="Times New Roman"/>
-          <w:sz w:val="28"/>
-          <w:szCs w:val="28"/>
-        </w:rPr>
-        <w:t xml:space="preserve"> №2</w:t>
-      </w:r>
-      <w:r>
-        <w:rPr>
-          <w:rFonts w:ascii="Times New Roman" w:hAnsi="Times New Roman" w:cs="Times New Roman"/>
-          <w:sz w:val="28"/>
-          <w:szCs w:val="28"/>
-        </w:rPr>
-        <w:t xml:space="preserve"> студент</w:t>
-      </w:r>
-      <w:r>
-        <w:rPr>
-          <w:rFonts w:ascii="Times New Roman" w:hAnsi="Times New Roman" w:cs="Times New Roman"/>
-          <w:sz w:val="28"/>
-          <w:szCs w:val="28"/>
-          <w:lang w:val="en-US"/>
-        </w:rPr>
-        <w:t>:</w:t>
-      </w:r>
-      <w:r>
-        <w:rPr>
-          <w:rFonts w:ascii="Times New Roman" w:hAnsi="Times New Roman" w:cs="Times New Roman"/>
-          <w:sz w:val="28"/>
-          <w:szCs w:val="28"/>
-        </w:rPr>
-        <w:t xml:space="preserve"> АВТ-341 Владимиров. А.В.</w:t>
+        <w:jc w:val="center"/>
+        <w:rPr>
+          <w:rFonts w:ascii="Times New Roman" w:eastAsia="Times New Roman" w:hAnsi="Times New Roman" w:cs="Times New Roman"/>
+          <w:sz w:val="28"/>
+          <w:szCs w:val="28"/>
+          <w:lang w:eastAsia="ru-RU"/>
+        </w:rPr>
+      </w:pPr>
+      <w:bookmarkStart w:id="0" w:name="_Hlk195472042"/>
+      <w:bookmarkEnd w:id="0"/>
+      <w:r>
+        <w:rPr>
+          <w:rFonts w:ascii="Times New Roman" w:eastAsia="+mn-ea" w:hAnsi="Times New Roman" w:cs="Times New Roman"/>
+          <w:color w:val="000000"/>
+          <w:kern w:val="24"/>
+          <w:sz w:val="28"/>
+          <w:szCs w:val="28"/>
+          <w:lang w:eastAsia="ru-RU"/>
+        </w:rPr>
+        <w:t>МИНИСТЕРСТВО ОБРАЗОВАНИЯ И НАУКИ РОССИЙСКОЙ ФЕДЕРАЦИИ</w:t>
+      </w:r>
+    </w:p>
+    <w:p>
+      <w:pPr>
+        <w:jc w:val="center"/>
+        <w:rPr>
+          <w:rFonts w:ascii="Times New Roman" w:eastAsia="Times New Roman" w:hAnsi="Times New Roman" w:cs="Times New Roman"/>
+          <w:sz w:val="28"/>
+          <w:szCs w:val="28"/>
+          <w:lang w:eastAsia="ru-RU"/>
+        </w:rPr>
+      </w:pPr>
+    </w:p>
+    <w:p>
+      <w:pPr>
+        <w:jc w:val="center"/>
+        <w:rPr>
+          <w:rFonts w:ascii="Times New Roman" w:eastAsia="Times New Roman" w:hAnsi="Times New Roman" w:cs="Times New Roman"/>
+          <w:sz w:val="28"/>
+          <w:szCs w:val="28"/>
+          <w:lang w:eastAsia="ru-RU"/>
+        </w:rPr>
+      </w:pPr>
+      <w:r>
+        <w:rPr>
+          <w:rFonts w:ascii="Times New Roman" w:eastAsia="+mn-ea" w:hAnsi="Times New Roman" w:cs="Times New Roman"/>
+          <w:caps/>
+          <w:color w:val="000000"/>
+          <w:kern w:val="24"/>
+          <w:sz w:val="28"/>
+          <w:szCs w:val="28"/>
+          <w:lang w:eastAsia="ru-RU"/>
+        </w:rPr>
+        <w:t>ФЕДЕРАЛЬНОЕ государственное БЮДЖЕТНОЕ</w:t>
+      </w:r>
+    </w:p>
+    <w:p>
+      <w:pPr>
+        <w:jc w:val="center"/>
+        <w:rPr>
+          <w:rFonts w:ascii="Times New Roman" w:eastAsia="Times New Roman" w:hAnsi="Times New Roman" w:cs="Times New Roman"/>
+          <w:sz w:val="28"/>
+          <w:szCs w:val="28"/>
+          <w:lang w:eastAsia="ru-RU"/>
+        </w:rPr>
+      </w:pPr>
+      <w:r>
+        <w:rPr>
+          <w:rFonts w:ascii="Times New Roman" w:eastAsia="+mn-ea" w:hAnsi="Times New Roman" w:cs="Times New Roman"/>
+          <w:caps/>
+          <w:color w:val="000000"/>
+          <w:kern w:val="24"/>
+          <w:sz w:val="28"/>
+          <w:szCs w:val="28"/>
+          <w:lang w:eastAsia="ru-RU"/>
+        </w:rPr>
+        <w:t>образовательное учреждение</w:t>
+      </w:r>
+    </w:p>
+    <w:p>
+      <w:pPr>
+        <w:jc w:val="center"/>
+        <w:rPr>
+          <w:rFonts w:ascii="Times New Roman" w:eastAsia="Times New Roman" w:hAnsi="Times New Roman" w:cs="Times New Roman"/>
+          <w:sz w:val="28"/>
+          <w:szCs w:val="28"/>
+          <w:lang w:eastAsia="ru-RU"/>
+        </w:rPr>
+      </w:pPr>
+      <w:r>
+        <w:rPr>
+          <w:rFonts w:ascii="Times New Roman" w:eastAsia="+mn-ea" w:hAnsi="Times New Roman" w:cs="Times New Roman"/>
+          <w:caps/>
+          <w:color w:val="000000"/>
+          <w:kern w:val="24"/>
+          <w:sz w:val="28"/>
+          <w:szCs w:val="28"/>
+          <w:lang w:eastAsia="ru-RU"/>
+        </w:rPr>
+        <w:t>высшего образования</w:t>
+      </w:r>
+    </w:p>
+    <w:p>
+      <w:pPr>
+        <w:jc w:val="center"/>
+        <w:rPr>
+          <w:rFonts w:ascii="Times New Roman" w:eastAsia="Times New Roman" w:hAnsi="Times New Roman" w:cs="Times New Roman"/>
+          <w:sz w:val="28"/>
+          <w:szCs w:val="28"/>
+          <w:lang w:eastAsia="ru-RU"/>
+        </w:rPr>
+      </w:pPr>
+      <w:r>
+        <w:rPr>
+          <w:rFonts w:ascii="Times New Roman" w:eastAsia="+mn-ea" w:hAnsi="Times New Roman" w:cs="Times New Roman"/>
+          <w:bCs/>
+          <w:color w:val="000000"/>
+          <w:kern w:val="24"/>
+          <w:sz w:val="28"/>
+          <w:szCs w:val="28"/>
+          <w:lang w:eastAsia="ru-RU"/>
+        </w:rPr>
+        <w:t>«НОВОСИБИРСКИЙ ГОСУДАРСТВЕННЫЙ ТЕХНИЧЕСКИЙ УНИВЕРСИТЕТ»</w:t>
+      </w:r>
+    </w:p>
+    <w:p>
+      <w:pPr>
+        <w:jc w:val="center"/>
+        <w:rPr>
+          <w:rFonts w:ascii="Times New Roman" w:hAnsi="Times New Roman" w:cs="Times New Roman"/>
+          <w:color w:val="000000"/>
+          <w:sz w:val="28"/>
+          <w:szCs w:val="28"/>
+          <w:shd w:val="clear" w:color="auto" w:fill="FFFFFF"/>
+        </w:rPr>
+      </w:pPr>
+      <w:r>
+        <w:rPr>
+          <w:rFonts w:ascii="Times New Roman" w:hAnsi="Times New Roman" w:cs="Times New Roman"/>
+          <w:color w:val="000000"/>
+          <w:sz w:val="28"/>
+          <w:szCs w:val="28"/>
+        </w:rPr>
+        <w:br/>
+      </w:r>
+      <w:r>
+        <w:rPr>
+          <w:rFonts w:ascii="Times New Roman" w:hAnsi="Times New Roman" w:cs="Times New Roman"/>
+          <w:color w:val="000000"/>
+          <w:sz w:val="28"/>
+          <w:szCs w:val="28"/>
+          <w:shd w:val="clear" w:color="auto" w:fill="FFFFFF"/>
+        </w:rPr>
+        <w:t>Кафедра вычислительной техники</w:t>
+      </w:r>
+    </w:p>
+    <w:p>
+      <w:pPr>
+        <w:jc w:val="center"/>
+        <w:rPr>
+          <w:rFonts w:ascii="Times New Roman" w:hAnsi="Times New Roman" w:cs="Times New Roman"/>
+          <w:color w:val="000000"/>
+          <w:sz w:val="28"/>
+          <w:szCs w:val="28"/>
+          <w:shd w:val="clear" w:color="auto" w:fill="FFFFFF"/>
+        </w:rPr>
+      </w:pPr>
+    </w:p>
+    <w:p>
+      <w:pPr>
+        <w:jc w:val="center"/>
+        <w:rPr>
+          <w:rFonts w:ascii="Times New Roman" w:hAnsi="Times New Roman" w:cs="Times New Roman"/>
+          <w:i/>
+          <w:sz w:val="28"/>
+          <w:szCs w:val="28"/>
+        </w:rPr>
+      </w:pPr>
+    </w:p>
+    <w:p>
+      <w:pPr>
+        <w:jc w:val="center"/>
+        <w:rPr>
+          <w:rFonts w:ascii="Times New Roman" w:hAnsi="Times New Roman" w:cs="Times New Roman"/>
+          <w:b/>
+          <w:sz w:val="28"/>
+          <w:szCs w:val="28"/>
+        </w:rPr>
+      </w:pPr>
+    </w:p>
+    <w:p>
+      <w:pPr>
+        <w:spacing w:line="360" w:lineRule="auto"/>
+        <w:jc w:val="center"/>
+        <w:rPr>
+          <w:rFonts w:ascii="Times New Roman" w:hAnsi="Times New Roman" w:cs="Times New Roman"/>
+          <w:b/>
+          <w:sz w:val="28"/>
+          <w:szCs w:val="28"/>
+        </w:rPr>
+      </w:pPr>
+      <w:r>
+        <w:rPr>
+          <w:rFonts w:ascii="Times New Roman" w:hAnsi="Times New Roman" w:cs="Times New Roman"/>
+          <w:b/>
+          <w:sz w:val="28"/>
+          <w:szCs w:val="28"/>
+        </w:rPr>
+        <w:t>Практическая работа №</w:t>
+      </w:r>
+      <w:r>
+        <w:rPr>
+          <w:rFonts w:ascii="Times New Roman" w:hAnsi="Times New Roman" w:cs="Times New Roman"/>
+          <w:b/>
+          <w:sz w:val="28"/>
+          <w:szCs w:val="28"/>
+        </w:rPr>
+        <w:t>2</w:t>
+      </w:r>
+    </w:p>
+    <w:p>
+      <w:pPr>
+        <w:spacing w:line="360" w:lineRule="auto"/>
+        <w:jc w:val="center"/>
+        <w:rPr>
+          <w:rFonts w:ascii="Times New Roman" w:hAnsi="Times New Roman" w:cs="Times New Roman"/>
+          <w:sz w:val="28"/>
+          <w:szCs w:val="28"/>
+        </w:rPr>
+      </w:pPr>
+      <w:r>
+        <w:rPr>
+          <w:rFonts w:ascii="Times New Roman" w:hAnsi="Times New Roman" w:cs="Times New Roman"/>
+          <w:bCs/>
+          <w:sz w:val="28"/>
+          <w:szCs w:val="28"/>
+        </w:rPr>
+        <w:t>По дисциплине:</w:t>
+      </w:r>
+      <w:r>
+        <w:rPr>
+          <w:rFonts w:ascii="Times New Roman" w:hAnsi="Times New Roman" w:cs="Times New Roman"/>
+          <w:sz w:val="28"/>
+          <w:szCs w:val="28"/>
+        </w:rPr>
+        <w:t xml:space="preserve"> «</w:t>
+      </w:r>
+      <w:r>
+        <w:rPr>
+          <w:rFonts w:ascii="Times New Roman" w:hAnsi="Times New Roman"/>
+          <w:sz w:val="28"/>
+          <w:szCs w:val="28"/>
+        </w:rPr>
+        <w:t xml:space="preserve">Системное </w:t>
+      </w:r>
+      <w:proofErr w:type="spellStart"/>
+      <w:r>
+        <w:rPr>
+          <w:rFonts w:ascii="Times New Roman" w:hAnsi="Times New Roman"/>
+          <w:sz w:val="28"/>
+          <w:szCs w:val="28"/>
+        </w:rPr>
+        <w:t>администирование</w:t>
+      </w:r>
+      <w:proofErr w:type="spellEnd"/>
+      <w:r>
+        <w:rPr>
+          <w:rFonts w:ascii="Times New Roman" w:hAnsi="Times New Roman" w:cs="Times New Roman"/>
+          <w:sz w:val="28"/>
+          <w:szCs w:val="28"/>
+        </w:rPr>
+        <w:t>»</w:t>
+      </w:r>
+    </w:p>
+    <w:p>
+      <w:pPr>
+        <w:spacing w:line="360" w:lineRule="auto"/>
+        <w:jc w:val="center"/>
+        <w:rPr>
+          <w:rFonts w:ascii="Times New Roman" w:hAnsi="Times New Roman" w:cs="Times New Roman"/>
+          <w:sz w:val="28"/>
+          <w:szCs w:val="28"/>
+        </w:rPr>
+      </w:pPr>
+      <w:r>
+        <w:rPr>
+          <w:rFonts w:ascii="Times New Roman" w:hAnsi="Times New Roman" w:cs="Times New Roman"/>
+          <w:sz w:val="28"/>
+          <w:szCs w:val="28"/>
+        </w:rPr>
+        <w:t>По теме: «</w:t>
+      </w:r>
+      <w:r>
+        <w:rPr>
+          <w:rFonts w:ascii="Times New Roman" w:hAnsi="Times New Roman" w:cs="Times New Roman"/>
+          <w:sz w:val="28"/>
+          <w:szCs w:val="28"/>
+        </w:rPr>
+        <w:t xml:space="preserve"> </w:t>
+      </w:r>
+      <w:r>
+        <w:rPr>
+          <w:rFonts w:ascii="Times New Roman" w:eastAsia="SimSun" w:hAnsi="Times New Roman"/>
+          <w:color w:val="000000"/>
+          <w:sz w:val="28"/>
+          <w:szCs w:val="28"/>
+        </w:rPr>
+        <w:t>Сетевая файловая система NFS v4</w:t>
+      </w:r>
+      <w:r>
+        <w:rPr>
+          <w:rFonts w:ascii="Times New Roman" w:eastAsia="SimSun" w:hAnsi="Times New Roman"/>
+          <w:color w:val="000000"/>
+          <w:sz w:val="28"/>
+          <w:szCs w:val="28"/>
+        </w:rPr>
+        <w:t xml:space="preserve"> </w:t>
+      </w:r>
+      <w:r>
+        <w:rPr>
+          <w:rFonts w:ascii="Times New Roman" w:hAnsi="Times New Roman" w:cs="Times New Roman"/>
+          <w:sz w:val="28"/>
+          <w:szCs w:val="28"/>
+        </w:rPr>
+        <w:t>»</w:t>
+      </w:r>
+    </w:p>
+    <w:p>
+      <w:pPr>
+        <w:spacing w:line="360" w:lineRule="auto"/>
+        <w:jc w:val="center"/>
+        <w:rPr>
+          <w:rFonts w:ascii="Times New Roman" w:hAnsi="Times New Roman" w:cs="Times New Roman"/>
+          <w:sz w:val="28"/>
+          <w:szCs w:val="28"/>
+        </w:rPr>
+      </w:pPr>
+    </w:p>
+    <w:p>
+      <w:pPr>
+        <w:spacing w:line="360" w:lineRule="auto"/>
+        <w:rPr>
+          <w:rFonts w:ascii="Times New Roman" w:hAnsi="Times New Roman" w:cs="Times New Roman"/>
+          <w:b/>
+          <w:sz w:val="28"/>
+          <w:szCs w:val="28"/>
+        </w:rPr>
+      </w:pPr>
+    </w:p>
+    <w:p>
+      <w:pPr>
+        <w:spacing w:line="360" w:lineRule="auto"/>
+        <w:jc w:val="center"/>
+        <w:rPr>
+          <w:rFonts w:ascii="Times New Roman" w:hAnsi="Times New Roman" w:cs="Times New Roman"/>
+          <w:i/>
+          <w:sz w:val="28"/>
+          <w:szCs w:val="28"/>
+        </w:rPr>
+      </w:pPr>
+    </w:p>
+    <w:p>
+      <w:pPr>
+        <w:tabs>
+          <w:tab w:val="left" w:pos="0"/>
+          <w:tab w:val="left" w:pos="6237"/>
+        </w:tabs>
+        <w:spacing w:line="360" w:lineRule="auto"/>
+        <w:rPr>
+          <w:rFonts w:ascii="Times New Roman" w:hAnsi="Times New Roman" w:cs="Times New Roman"/>
+          <w:sz w:val="28"/>
+          <w:szCs w:val="28"/>
+        </w:rPr>
+      </w:pPr>
+      <w:r>
+        <w:rPr>
+          <w:rFonts w:ascii="Times New Roman" w:hAnsi="Times New Roman" w:cs="Times New Roman"/>
+          <w:sz w:val="28"/>
+          <w:szCs w:val="28"/>
+        </w:rPr>
+        <w:t>Группа: АВТ-341</w:t>
+      </w:r>
+    </w:p>
+    <w:p>
+      <w:pPr>
+        <w:tabs>
+          <w:tab w:val="left" w:pos="0"/>
+          <w:tab w:val="left" w:pos="6237"/>
+        </w:tabs>
+        <w:spacing w:line="360" w:lineRule="auto"/>
+        <w:rPr>
+          <w:rFonts w:ascii="Times New Roman" w:hAnsi="Times New Roman" w:cs="Times New Roman"/>
+          <w:sz w:val="28"/>
+          <w:szCs w:val="28"/>
+        </w:rPr>
+      </w:pPr>
+      <w:r>
+        <w:rPr>
+          <w:rFonts w:ascii="Times New Roman" w:hAnsi="Times New Roman" w:cs="Times New Roman"/>
+          <w:sz w:val="28"/>
+          <w:szCs w:val="28"/>
+        </w:rPr>
+        <w:t xml:space="preserve">Факультет: АВТФ                        </w:t>
+      </w:r>
+      <w:r>
+        <w:rPr>
+          <w:rFonts w:ascii="Times New Roman" w:hAnsi="Times New Roman" w:cs="Times New Roman"/>
+          <w:sz w:val="28"/>
+          <w:szCs w:val="28"/>
+        </w:rPr>
+        <w:tab/>
+      </w:r>
+    </w:p>
+    <w:p>
+      <w:pPr>
+        <w:tabs>
+          <w:tab w:val="left" w:pos="0"/>
+          <w:tab w:val="left" w:pos="6237"/>
+        </w:tabs>
+        <w:spacing w:line="360" w:lineRule="auto"/>
+        <w:rPr>
+          <w:rFonts w:ascii="Times New Roman" w:hAnsi="Times New Roman" w:cs="Times New Roman"/>
+          <w:sz w:val="28"/>
+          <w:szCs w:val="28"/>
+        </w:rPr>
+      </w:pPr>
+      <w:r>
+        <w:rPr>
+          <w:rFonts w:ascii="Times New Roman" w:hAnsi="Times New Roman" w:cs="Times New Roman"/>
+          <w:sz w:val="28"/>
+          <w:szCs w:val="28"/>
+        </w:rPr>
+        <w:t>Студент: Владимиров А. В.</w:t>
+      </w:r>
+    </w:p>
+    <w:p>
+      <w:pPr>
+        <w:tabs>
+          <w:tab w:val="left" w:pos="0"/>
+          <w:tab w:val="left" w:pos="6237"/>
+        </w:tabs>
+        <w:spacing w:line="360" w:lineRule="auto"/>
+        <w:rPr>
+          <w:rFonts w:ascii="Times New Roman" w:hAnsi="Times New Roman" w:cs="Times New Roman"/>
+          <w:sz w:val="28"/>
+          <w:szCs w:val="28"/>
+        </w:rPr>
+      </w:pPr>
+      <w:r>
+        <w:rPr>
+          <w:rFonts w:ascii="Times New Roman" w:hAnsi="Times New Roman" w:cs="Times New Roman"/>
+          <w:sz w:val="28"/>
+          <w:szCs w:val="28"/>
+        </w:rPr>
+        <w:t xml:space="preserve">Преподаватель: </w:t>
+      </w:r>
+      <w:proofErr w:type="spellStart"/>
+      <w:r>
+        <w:rPr>
+          <w:rFonts w:ascii="Times New Roman" w:hAnsi="Times New Roman" w:cs="Times New Roman"/>
+          <w:sz w:val="28"/>
+          <w:szCs w:val="28"/>
+        </w:rPr>
+        <w:t>Менжулин</w:t>
+      </w:r>
+      <w:proofErr w:type="spellEnd"/>
+      <w:r>
+        <w:rPr>
+          <w:rFonts w:ascii="Times New Roman" w:hAnsi="Times New Roman" w:cs="Times New Roman"/>
+          <w:sz w:val="28"/>
+          <w:szCs w:val="28"/>
+        </w:rPr>
+        <w:t xml:space="preserve"> С. А.</w:t>
+      </w:r>
+    </w:p>
+    <w:p>
+      <w:pPr>
+        <w:tabs>
+          <w:tab w:val="left" w:pos="142"/>
+          <w:tab w:val="left" w:pos="709"/>
+          <w:tab w:val="left" w:pos="6521"/>
+          <w:tab w:val="left" w:pos="7230"/>
+        </w:tabs>
+        <w:rPr>
+          <w:rFonts w:ascii="Times New Roman" w:hAnsi="Times New Roman" w:cs="Times New Roman"/>
+          <w:i/>
+          <w:sz w:val="28"/>
+          <w:szCs w:val="28"/>
+        </w:rPr>
+      </w:pPr>
+    </w:p>
+    <w:p>
+      <w:pPr>
+        <w:pStyle w:val="Standard"/>
+        <w:rPr>
+          <w:rFonts w:ascii="Times New Roman" w:hAnsi="Times New Roman"/>
+          <w:sz w:val="28"/>
+          <w:szCs w:val="28"/>
+        </w:rPr>
+      </w:pPr>
+    </w:p>
+    <w:p>
+      <w:pPr>
+        <w:pStyle w:val="Standard"/>
+        <w:ind w:left="720"/>
+        <w:jc w:val="center"/>
+        <w:rPr>
+          <w:rFonts w:ascii="Times New Roman" w:hAnsi="Times New Roman"/>
+          <w:sz w:val="28"/>
+          <w:szCs w:val="28"/>
+        </w:rPr>
+      </w:pPr>
+      <w:r>
+        <w:rPr>
+          <w:rFonts w:ascii="Times New Roman" w:hAnsi="Times New Roman"/>
+          <w:sz w:val="28"/>
+          <w:szCs w:val="28"/>
+        </w:rPr>
+        <w:t>Новосибирск 2026</w:t>
       </w:r>
     </w:p>
     <w:p>
@@ -87,25 +543,237 @@
           <w:sz w:val="28"/>
           <w:szCs w:val="28"/>
         </w:rPr>
-        <w:t>I) На сервере для первого практического занятия выполнить монтирование каталогов /etc/snmp /var/log в каталоге /srv/nfs/ с использованием опции bind команды mount.</w:t>
-      </w:r>
-    </w:p>
-    <w:p>
-      <w:pPr>
-        <w:rPr>
-          <w:rFonts w:ascii="Times New Roman" w:hAnsi="Times New Roman" w:cs="Times New Roman"/>
-          <w:sz w:val="28"/>
-          <w:szCs w:val="28"/>
-          <w:lang w:val="en-US"/>
-        </w:rPr>
-      </w:pPr>
-      <w:r>
-        <w:rPr>
-          <w:rFonts w:ascii="Times New Roman" w:hAnsi="Times New Roman" w:cs="Times New Roman"/>
-          <w:sz w:val="28"/>
-          <w:szCs w:val="28"/>
-        </w:rPr>
-        <w:t>Сначала создаем структуру каталогов, которая станет "корнем" экспорта NFSv4, и подключаем в неё нужные папки с помощью mount --bind:</w:t>
+        <w:lastRenderedPageBreak/>
+        <w:t>I) На сервере для первого практического занятия выполнить монтирование каталогов /</w:t>
+      </w:r>
+      <w:proofErr w:type="spellStart"/>
+      <w:r>
+        <w:rPr>
+          <w:rFonts w:ascii="Times New Roman" w:hAnsi="Times New Roman" w:cs="Times New Roman"/>
+          <w:b/>
+          <w:bCs/>
+          <w:sz w:val="28"/>
+          <w:szCs w:val="28"/>
+        </w:rPr>
+        <w:t>etc</w:t>
+      </w:r>
+      <w:proofErr w:type="spellEnd"/>
+      <w:r>
+        <w:rPr>
+          <w:rFonts w:ascii="Times New Roman" w:hAnsi="Times New Roman" w:cs="Times New Roman"/>
+          <w:b/>
+          <w:bCs/>
+          <w:sz w:val="28"/>
+          <w:szCs w:val="28"/>
+        </w:rPr>
+        <w:t>/</w:t>
+      </w:r>
+      <w:proofErr w:type="spellStart"/>
+      <w:r>
+        <w:rPr>
+          <w:rFonts w:ascii="Times New Roman" w:hAnsi="Times New Roman" w:cs="Times New Roman"/>
+          <w:b/>
+          <w:bCs/>
+          <w:sz w:val="28"/>
+          <w:szCs w:val="28"/>
+        </w:rPr>
+        <w:t>snmp</w:t>
+      </w:r>
+      <w:proofErr w:type="spellEnd"/>
+      <w:r>
+        <w:rPr>
+          <w:rFonts w:ascii="Times New Roman" w:hAnsi="Times New Roman" w:cs="Times New Roman"/>
+          <w:b/>
+          <w:bCs/>
+          <w:sz w:val="28"/>
+          <w:szCs w:val="28"/>
+        </w:rPr>
+        <w:t xml:space="preserve"> /</w:t>
+      </w:r>
+      <w:proofErr w:type="spellStart"/>
+      <w:r>
+        <w:rPr>
+          <w:rFonts w:ascii="Times New Roman" w:hAnsi="Times New Roman" w:cs="Times New Roman"/>
+          <w:b/>
+          <w:bCs/>
+          <w:sz w:val="28"/>
+          <w:szCs w:val="28"/>
+        </w:rPr>
+        <w:t>var</w:t>
+      </w:r>
+      <w:proofErr w:type="spellEnd"/>
+      <w:r>
+        <w:rPr>
+          <w:rFonts w:ascii="Times New Roman" w:hAnsi="Times New Roman" w:cs="Times New Roman"/>
+          <w:b/>
+          <w:bCs/>
+          <w:sz w:val="28"/>
+          <w:szCs w:val="28"/>
+        </w:rPr>
+        <w:t>/</w:t>
+      </w:r>
+      <w:proofErr w:type="spellStart"/>
+      <w:r>
+        <w:rPr>
+          <w:rFonts w:ascii="Times New Roman" w:hAnsi="Times New Roman" w:cs="Times New Roman"/>
+          <w:b/>
+          <w:bCs/>
+          <w:sz w:val="28"/>
+          <w:szCs w:val="28"/>
+        </w:rPr>
+        <w:t>log</w:t>
+      </w:r>
+      <w:proofErr w:type="spellEnd"/>
+      <w:r>
+        <w:rPr>
+          <w:rFonts w:ascii="Times New Roman" w:hAnsi="Times New Roman" w:cs="Times New Roman"/>
+          <w:b/>
+          <w:bCs/>
+          <w:sz w:val="28"/>
+          <w:szCs w:val="28"/>
+        </w:rPr>
+        <w:t xml:space="preserve"> в каталоге /</w:t>
+      </w:r>
+      <w:proofErr w:type="spellStart"/>
+      <w:r>
+        <w:rPr>
+          <w:rFonts w:ascii="Times New Roman" w:hAnsi="Times New Roman" w:cs="Times New Roman"/>
+          <w:b/>
+          <w:bCs/>
+          <w:sz w:val="28"/>
+          <w:szCs w:val="28"/>
+        </w:rPr>
+        <w:t>srv</w:t>
+      </w:r>
+      <w:proofErr w:type="spellEnd"/>
+      <w:r>
+        <w:rPr>
+          <w:rFonts w:ascii="Times New Roman" w:hAnsi="Times New Roman" w:cs="Times New Roman"/>
+          <w:b/>
+          <w:bCs/>
+          <w:sz w:val="28"/>
+          <w:szCs w:val="28"/>
+        </w:rPr>
+        <w:t>/</w:t>
+      </w:r>
+      <w:proofErr w:type="spellStart"/>
+      <w:r>
+        <w:rPr>
+          <w:rFonts w:ascii="Times New Roman" w:hAnsi="Times New Roman" w:cs="Times New Roman"/>
+          <w:b/>
+          <w:bCs/>
+          <w:sz w:val="28"/>
+          <w:szCs w:val="28"/>
+        </w:rPr>
+        <w:t>nfs</w:t>
+      </w:r>
+      <w:proofErr w:type="spellEnd"/>
+      <w:r>
+        <w:rPr>
+          <w:rFonts w:ascii="Times New Roman" w:hAnsi="Times New Roman" w:cs="Times New Roman"/>
+          <w:b/>
+          <w:bCs/>
+          <w:sz w:val="28"/>
+          <w:szCs w:val="28"/>
+        </w:rPr>
+        <w:t xml:space="preserve">/ с использованием опции </w:t>
+      </w:r>
+      <w:proofErr w:type="spellStart"/>
+      <w:r>
+        <w:rPr>
+          <w:rFonts w:ascii="Times New Roman" w:hAnsi="Times New Roman" w:cs="Times New Roman"/>
+          <w:b/>
+          <w:bCs/>
+          <w:sz w:val="28"/>
+          <w:szCs w:val="28"/>
+        </w:rPr>
+        <w:t>bind</w:t>
+      </w:r>
+      <w:proofErr w:type="spellEnd"/>
+      <w:r>
+        <w:rPr>
+          <w:rFonts w:ascii="Times New Roman" w:hAnsi="Times New Roman" w:cs="Times New Roman"/>
+          <w:b/>
+          <w:bCs/>
+          <w:sz w:val="28"/>
+          <w:szCs w:val="28"/>
+        </w:rPr>
+        <w:t xml:space="preserve"> команды </w:t>
+      </w:r>
+      <w:proofErr w:type="spellStart"/>
+      <w:r>
+        <w:rPr>
+          <w:rFonts w:ascii="Times New Roman" w:hAnsi="Times New Roman" w:cs="Times New Roman"/>
+          <w:b/>
+          <w:bCs/>
+          <w:sz w:val="28"/>
+          <w:szCs w:val="28"/>
+        </w:rPr>
+        <w:t>mount</w:t>
+      </w:r>
+      <w:proofErr w:type="spellEnd"/>
+      <w:r>
+        <w:rPr>
+          <w:rFonts w:ascii="Times New Roman" w:hAnsi="Times New Roman" w:cs="Times New Roman"/>
+          <w:b/>
+          <w:bCs/>
+          <w:sz w:val="28"/>
+          <w:szCs w:val="28"/>
+        </w:rPr>
+        <w:t>.</w:t>
+      </w:r>
+    </w:p>
+    <w:p>
+      <w:pPr>
+        <w:rPr>
+          <w:rFonts w:ascii="Times New Roman" w:hAnsi="Times New Roman" w:cs="Times New Roman"/>
+          <w:sz w:val="28"/>
+          <w:szCs w:val="28"/>
+        </w:rPr>
+      </w:pPr>
+      <w:r>
+        <w:rPr>
+          <w:rFonts w:ascii="Times New Roman" w:hAnsi="Times New Roman" w:cs="Times New Roman"/>
+          <w:sz w:val="28"/>
+          <w:szCs w:val="28"/>
+        </w:rPr>
+        <w:t xml:space="preserve">Сначала создаем структуру каталогов, которая станет "корнем" экспорта NFSv4, и подключаем в неё нужные папки с помощью </w:t>
+      </w:r>
+      <w:proofErr w:type="spellStart"/>
+      <w:r>
+        <w:rPr>
+          <w:rFonts w:ascii="Times New Roman" w:hAnsi="Times New Roman" w:cs="Times New Roman"/>
+          <w:sz w:val="28"/>
+          <w:szCs w:val="28"/>
+        </w:rPr>
+        <w:t>mount</w:t>
+      </w:r>
+      <w:proofErr w:type="spellEnd"/>
+      <w:r>
+        <w:rPr>
+          <w:rFonts w:ascii="Times New Roman" w:hAnsi="Times New Roman" w:cs="Times New Roman"/>
+          <w:sz w:val="28"/>
+          <w:szCs w:val="28"/>
+        </w:rPr>
+        <w:t xml:space="preserve"> --</w:t>
+      </w:r>
+      <w:proofErr w:type="spellStart"/>
+      <w:r>
+        <w:rPr>
+          <w:rFonts w:ascii="Times New Roman" w:hAnsi="Times New Roman" w:cs="Times New Roman"/>
+          <w:sz w:val="28"/>
+          <w:szCs w:val="28"/>
+        </w:rPr>
+        <w:t>bind</w:t>
+      </w:r>
+      <w:proofErr w:type="spellEnd"/>
+      <w:r>
+        <w:rPr>
+          <w:rFonts w:ascii="Times New Roman" w:hAnsi="Times New Roman" w:cs="Times New Roman"/>
+          <w:sz w:val="28"/>
+          <w:szCs w:val="28"/>
+        </w:rPr>
+        <w:t>:</w:t>
       </w:r>
     </w:p>
     <w:p>
@@ -193,7 +861,43 @@
           <w:sz w:val="28"/>
           <w:szCs w:val="28"/>
         </w:rPr>
-        <w:t>2) Создаём точки монтирования для snmp и log:</w:t>
+        <w:t xml:space="preserve">2) Создаём точки монтирования для </w:t>
+      </w:r>
+      <w:proofErr w:type="spellStart"/>
+      <w:r>
+        <w:rPr>
+          <w:rFonts w:ascii="Times New Roman" w:hAnsi="Times New Roman" w:cs="Times New Roman"/>
+          <w:sz w:val="28"/>
+          <w:szCs w:val="28"/>
+        </w:rPr>
+        <w:t>snmp</w:t>
+      </w:r>
+      <w:proofErr w:type="spellEnd"/>
+      <w:r>
+        <w:rPr>
+          <w:rFonts w:ascii="Times New Roman" w:hAnsi="Times New Roman" w:cs="Times New Roman"/>
+          <w:sz w:val="28"/>
+          <w:szCs w:val="28"/>
+        </w:rPr>
+        <w:t xml:space="preserve"> и </w:t>
+      </w:r>
+      <w:proofErr w:type="spellStart"/>
+      <w:r>
+        <w:rPr>
+          <w:rFonts w:ascii="Times New Roman" w:hAnsi="Times New Roman" w:cs="Times New Roman"/>
+          <w:sz w:val="28"/>
+          <w:szCs w:val="28"/>
+        </w:rPr>
+        <w:t>log</w:t>
+      </w:r>
+      <w:proofErr w:type="spellEnd"/>
+      <w:r>
+        <w:rPr>
+          <w:rFonts w:ascii="Times New Roman" w:hAnsi="Times New Roman" w:cs="Times New Roman"/>
+          <w:sz w:val="28"/>
+          <w:szCs w:val="28"/>
+        </w:rPr>
+        <w:t>:</w:t>
       </w:r>
     </w:p>
     <w:p>
@@ -263,7 +967,79 @@
           <w:sz w:val="28"/>
           <w:szCs w:val="28"/>
         </w:rPr>
-        <w:t>3) Выполним bind mount для подключения системных папок в структуру /srv/nfs:</w:t>
+        <w:t xml:space="preserve">3) Выполним </w:t>
+      </w:r>
+      <w:proofErr w:type="spellStart"/>
+      <w:r>
+        <w:rPr>
+          <w:rFonts w:ascii="Times New Roman" w:hAnsi="Times New Roman" w:cs="Times New Roman"/>
+          <w:sz w:val="28"/>
+          <w:szCs w:val="28"/>
+        </w:rPr>
+        <w:t>bind</w:t>
+      </w:r>
+      <w:proofErr w:type="spellEnd"/>
+      <w:r>
+        <w:rPr>
+          <w:rFonts w:ascii="Times New Roman" w:hAnsi="Times New Roman" w:cs="Times New Roman"/>
+          <w:sz w:val="28"/>
+          <w:szCs w:val="28"/>
+        </w:rPr>
+        <w:t xml:space="preserve"> </w:t>
+      </w:r>
+      <w:proofErr w:type="spellStart"/>
+      <w:r>
+        <w:rPr>
+          <w:rFonts w:ascii="Times New Roman" w:hAnsi="Times New Roman" w:cs="Times New Roman"/>
+          <w:sz w:val="28"/>
+          <w:szCs w:val="28"/>
+        </w:rPr>
+        <w:t>mount</w:t>
+      </w:r>
+      <w:proofErr w:type="spellEnd"/>
+      <w:r>
+        <w:rPr>
+          <w:rFonts w:ascii="Times New Roman" w:hAnsi="Times New Roman" w:cs="Times New Roman"/>
+          <w:sz w:val="28"/>
+          <w:szCs w:val="28"/>
+        </w:rPr>
+        <w:t xml:space="preserve"> для подключения системных папок в структуру /</w:t>
+      </w:r>
+      <w:proofErr w:type="spellStart"/>
+      <w:r>
+        <w:rPr>
+          <w:rFonts w:ascii="Times New Roman" w:hAnsi="Times New Roman" w:cs="Times New Roman"/>
+          <w:sz w:val="28"/>
+          <w:szCs w:val="28"/>
+        </w:rPr>
+        <w:t>srv</w:t>
+      </w:r>
+      <w:proofErr w:type="spellEnd"/>
+      <w:r>
+        <w:rPr>
+          <w:rFonts w:ascii="Times New Roman" w:hAnsi="Times New Roman" w:cs="Times New Roman"/>
+          <w:sz w:val="28"/>
+          <w:szCs w:val="28"/>
+        </w:rPr>
+        <w:t>/</w:t>
+      </w:r>
+      <w:proofErr w:type="spellStart"/>
+      <w:r>
+        <w:rPr>
+          <w:rFonts w:ascii="Times New Roman" w:hAnsi="Times New Roman" w:cs="Times New Roman"/>
+          <w:sz w:val="28"/>
+          <w:szCs w:val="28"/>
+        </w:rPr>
+        <w:t>nfs</w:t>
+      </w:r>
+      <w:proofErr w:type="spellEnd"/>
+      <w:r>
+        <w:rPr>
+          <w:rFonts w:ascii="Times New Roman" w:hAnsi="Times New Roman" w:cs="Times New Roman"/>
+          <w:sz w:val="28"/>
+          <w:szCs w:val="28"/>
+        </w:rPr>
+        <w:t>:</w:t>
       </w:r>
     </w:p>
     <w:p>
@@ -326,32 +1102,51 @@
           <w:rFonts w:ascii="Times New Roman" w:hAnsi="Times New Roman" w:cs="Times New Roman"/>
           <w:sz w:val="28"/>
           <w:szCs w:val="28"/>
-          <w:lang w:val="en-US"/>
-        </w:rPr>
-      </w:pPr>
-      <w:r>
-        <w:rPr>
-          <w:rFonts w:ascii="Times New Roman" w:hAnsi="Times New Roman" w:cs="Times New Roman"/>
-          <w:sz w:val="28"/>
-          <w:szCs w:val="28"/>
-        </w:rPr>
-        <w:t>4) Чтобы каталоги оставались смонтированы после перезагрузки, добавим записи</w:t>
-      </w:r>
-      <w:r>
-        <w:rPr>
-          <w:rFonts w:ascii="Times New Roman" w:hAnsi="Times New Roman" w:cs="Times New Roman"/>
-          <w:sz w:val="28"/>
-          <w:szCs w:val="28"/>
-        </w:rPr>
-        <w:t xml:space="preserve"> </w:t>
-      </w:r>
-      <w:r>
-        <w:rPr>
-          <w:rFonts w:ascii="Times New Roman" w:hAnsi="Times New Roman" w:cs="Times New Roman"/>
-          <w:sz w:val="28"/>
-          <w:szCs w:val="28"/>
-        </w:rPr>
-        <w:t>в /etc/fstab:</w:t>
+        </w:rPr>
+      </w:pPr>
+      <w:r>
+        <w:rPr>
+          <w:rFonts w:ascii="Times New Roman" w:hAnsi="Times New Roman" w:cs="Times New Roman"/>
+          <w:sz w:val="28"/>
+          <w:szCs w:val="28"/>
+        </w:rPr>
+        <w:t>4) Чтобы каталоги оставались смонтированы после перезагрузки, добавим записи в /</w:t>
+      </w:r>
+      <w:proofErr w:type="spellStart"/>
+      <w:r>
+        <w:rPr>
+          <w:rFonts w:ascii="Times New Roman" w:hAnsi="Times New Roman" w:cs="Times New Roman"/>
+          <w:sz w:val="28"/>
+          <w:szCs w:val="28"/>
+        </w:rPr>
+        <w:t>etc</w:t>
+      </w:r>
+      <w:proofErr w:type="spellEnd"/>
+      <w:r>
+        <w:rPr>
+          <w:rFonts w:ascii="Times New Roman" w:hAnsi="Times New Roman" w:cs="Times New Roman"/>
+          <w:sz w:val="28"/>
+          <w:szCs w:val="28"/>
+        </w:rPr>
+        <w:t>/</w:t>
+      </w:r>
+      <w:proofErr w:type="spellStart"/>
+      <w:r>
+        <w:rPr>
+          <w:rFonts w:ascii="Times New Roman" w:hAnsi="Times New Roman" w:cs="Times New Roman"/>
+          <w:sz w:val="28"/>
+          <w:szCs w:val="28"/>
+        </w:rPr>
+        <w:t>fstab</w:t>
+      </w:r>
+      <w:proofErr w:type="spellEnd"/>
+      <w:r>
+        <w:rPr>
+          <w:rFonts w:ascii="Times New Roman" w:hAnsi="Times New Roman" w:cs="Times New Roman"/>
+          <w:sz w:val="28"/>
+          <w:szCs w:val="28"/>
+        </w:rPr>
+        <w:t>:</w:t>
       </w:r>
     </w:p>
     <w:p>
@@ -471,23 +1266,7 @@
           <w:sz w:val="28"/>
           <w:szCs w:val="28"/>
         </w:rPr>
-        <w:t>5) Проверим что каталог</w:t>
-      </w:r>
-      <w:r>
-        <w:rPr>
-          <w:rFonts w:ascii="Times New Roman" w:hAnsi="Times New Roman" w:cs="Times New Roman"/>
-          <w:sz w:val="28"/>
-          <w:szCs w:val="28"/>
-        </w:rPr>
-        <w:t>и</w:t>
-      </w:r>
-      <w:r>
-        <w:rPr>
-          <w:rFonts w:ascii="Times New Roman" w:hAnsi="Times New Roman" w:cs="Times New Roman"/>
-          <w:sz w:val="28"/>
-          <w:szCs w:val="28"/>
-        </w:rPr>
-        <w:t xml:space="preserve"> смонтированы:</w:t>
+        <w:t>5) Проверим что каталоги смонтированы:</w:t>
       </w:r>
     </w:p>
     <w:p>
@@ -610,7 +1389,6 @@
           <w:bCs/>
           <w:sz w:val="28"/>
           <w:szCs w:val="28"/>
-          <w:lang w:val="en-US"/>
         </w:rPr>
       </w:pPr>
       <w:r>
@@ -621,24 +1399,175 @@
           <w:sz w:val="28"/>
           <w:szCs w:val="28"/>
         </w:rPr>
-        <w:t>II) Установить службу NFS v4 на сервере для первого практического  занятия, экспортировать через протокол NFS v4  каталог /srv/nfs/snmp в режиме «чтение и запись» и каталог /srv/nfs/log в режиме «только чтение» для адреса сервера второй практики.</w:t>
-      </w:r>
-    </w:p>
-    <w:p>
-      <w:pPr>
-        <w:rPr>
-          <w:rFonts w:ascii="Times New Roman" w:hAnsi="Times New Roman" w:cs="Times New Roman"/>
-          <w:sz w:val="28"/>
-          <w:szCs w:val="28"/>
-        </w:rPr>
-      </w:pPr>
-      <w:r>
-        <w:rPr>
-          <w:rFonts w:ascii="Times New Roman" w:hAnsi="Times New Roman" w:cs="Times New Roman"/>
-          <w:sz w:val="28"/>
-          <w:szCs w:val="28"/>
-        </w:rPr>
-        <w:t>6) Установим пакет nfs-utils на сервере для первого практического занятия:</w:t>
+        <w:lastRenderedPageBreak/>
+        <w:t>II) Установить службу NFS v4 на сервере для первого практического  занятия, экспортировать через протокол NFS v4  каталог /</w:t>
+      </w:r>
+      <w:proofErr w:type="spellStart"/>
+      <w:r>
+        <w:rPr>
+          <w:rFonts w:ascii="Times New Roman" w:hAnsi="Times New Roman" w:cs="Times New Roman"/>
+          <w:b/>
+          <w:bCs/>
+          <w:sz w:val="28"/>
+          <w:szCs w:val="28"/>
+        </w:rPr>
+        <w:t>srv</w:t>
+      </w:r>
+      <w:proofErr w:type="spellEnd"/>
+      <w:r>
+        <w:rPr>
+          <w:rFonts w:ascii="Times New Roman" w:hAnsi="Times New Roman" w:cs="Times New Roman"/>
+          <w:b/>
+          <w:bCs/>
+          <w:sz w:val="28"/>
+          <w:szCs w:val="28"/>
+        </w:rPr>
+        <w:t>/</w:t>
+      </w:r>
+      <w:proofErr w:type="spellStart"/>
+      <w:r>
+        <w:rPr>
+          <w:rFonts w:ascii="Times New Roman" w:hAnsi="Times New Roman" w:cs="Times New Roman"/>
+          <w:b/>
+          <w:bCs/>
+          <w:sz w:val="28"/>
+          <w:szCs w:val="28"/>
+        </w:rPr>
+        <w:t>nfs</w:t>
+      </w:r>
+      <w:proofErr w:type="spellEnd"/>
+      <w:r>
+        <w:rPr>
+          <w:rFonts w:ascii="Times New Roman" w:hAnsi="Times New Roman" w:cs="Times New Roman"/>
+          <w:b/>
+          <w:bCs/>
+          <w:sz w:val="28"/>
+          <w:szCs w:val="28"/>
+        </w:rPr>
+        <w:t>/</w:t>
+      </w:r>
+      <w:proofErr w:type="spellStart"/>
+      <w:r>
+        <w:rPr>
+          <w:rFonts w:ascii="Times New Roman" w:hAnsi="Times New Roman" w:cs="Times New Roman"/>
+          <w:b/>
+          <w:bCs/>
+          <w:sz w:val="28"/>
+          <w:szCs w:val="28"/>
+        </w:rPr>
+        <w:t>snmp</w:t>
+      </w:r>
+      <w:proofErr w:type="spellEnd"/>
+      <w:r>
+        <w:rPr>
+          <w:rFonts w:ascii="Times New Roman" w:hAnsi="Times New Roman" w:cs="Times New Roman"/>
+          <w:b/>
+          <w:bCs/>
+          <w:sz w:val="28"/>
+          <w:szCs w:val="28"/>
+        </w:rPr>
+        <w:t xml:space="preserve"> в режиме «чтение и запись» и каталог /</w:t>
+      </w:r>
+      <w:proofErr w:type="spellStart"/>
+      <w:r>
+        <w:rPr>
+          <w:rFonts w:ascii="Times New Roman" w:hAnsi="Times New Roman" w:cs="Times New Roman"/>
+          <w:b/>
+          <w:bCs/>
+          <w:sz w:val="28"/>
+          <w:szCs w:val="28"/>
+        </w:rPr>
+        <w:t>srv</w:t>
+      </w:r>
+      <w:proofErr w:type="spellEnd"/>
+      <w:r>
+        <w:rPr>
+          <w:rFonts w:ascii="Times New Roman" w:hAnsi="Times New Roman" w:cs="Times New Roman"/>
+          <w:b/>
+          <w:bCs/>
+          <w:sz w:val="28"/>
+          <w:szCs w:val="28"/>
+        </w:rPr>
+        <w:t>/</w:t>
+      </w:r>
+      <w:proofErr w:type="spellStart"/>
+      <w:r>
+        <w:rPr>
+          <w:rFonts w:ascii="Times New Roman" w:hAnsi="Times New Roman" w:cs="Times New Roman"/>
+          <w:b/>
+          <w:bCs/>
+          <w:sz w:val="28"/>
+          <w:szCs w:val="28"/>
+        </w:rPr>
+        <w:t>nfs</w:t>
+      </w:r>
+      <w:proofErr w:type="spellEnd"/>
+      <w:r>
+        <w:rPr>
+          <w:rFonts w:ascii="Times New Roman" w:hAnsi="Times New Roman" w:cs="Times New Roman"/>
+          <w:b/>
+          <w:bCs/>
+          <w:sz w:val="28"/>
+          <w:szCs w:val="28"/>
+        </w:rPr>
+        <w:t>/</w:t>
+      </w:r>
+      <w:proofErr w:type="spellStart"/>
+      <w:r>
+        <w:rPr>
+          <w:rFonts w:ascii="Times New Roman" w:hAnsi="Times New Roman" w:cs="Times New Roman"/>
+          <w:b/>
+          <w:bCs/>
+          <w:sz w:val="28"/>
+          <w:szCs w:val="28"/>
+        </w:rPr>
+        <w:t>log</w:t>
+      </w:r>
+      <w:proofErr w:type="spellEnd"/>
+      <w:r>
+        <w:rPr>
+          <w:rFonts w:ascii="Times New Roman" w:hAnsi="Times New Roman" w:cs="Times New Roman"/>
+          <w:b/>
+          <w:bCs/>
+          <w:sz w:val="28"/>
+          <w:szCs w:val="28"/>
+        </w:rPr>
+        <w:t xml:space="preserve"> в режиме «только чтение» для адреса сервера второй практики.</w:t>
+      </w:r>
+    </w:p>
+    <w:p>
+      <w:pPr>
+        <w:rPr>
+          <w:rFonts w:ascii="Times New Roman" w:hAnsi="Times New Roman" w:cs="Times New Roman"/>
+          <w:sz w:val="28"/>
+          <w:szCs w:val="28"/>
+        </w:rPr>
+      </w:pPr>
+      <w:r>
+        <w:rPr>
+          <w:rFonts w:ascii="Times New Roman" w:hAnsi="Times New Roman" w:cs="Times New Roman"/>
+          <w:sz w:val="28"/>
+          <w:szCs w:val="28"/>
+        </w:rPr>
+        <w:t xml:space="preserve">6) Установим пакет </w:t>
+      </w:r>
+      <w:proofErr w:type="spellStart"/>
+      <w:r>
+        <w:rPr>
+          <w:rFonts w:ascii="Times New Roman" w:hAnsi="Times New Roman" w:cs="Times New Roman"/>
+          <w:sz w:val="28"/>
+          <w:szCs w:val="28"/>
+        </w:rPr>
+        <w:t>nfs-utils</w:t>
+      </w:r>
+      <w:proofErr w:type="spellEnd"/>
+      <w:r>
+        <w:rPr>
+          <w:rFonts w:ascii="Times New Roman" w:hAnsi="Times New Roman" w:cs="Times New Roman"/>
+          <w:sz w:val="28"/>
+          <w:szCs w:val="28"/>
+        </w:rPr>
+        <w:t xml:space="preserve"> на сервере для первого практического занятия:</w:t>
       </w:r>
     </w:p>
     <w:p>
@@ -800,7 +1729,6 @@
           <w:rFonts w:ascii="Times New Roman" w:hAnsi="Times New Roman" w:cs="Times New Roman"/>
           <w:sz w:val="28"/>
           <w:szCs w:val="28"/>
-          <w:lang w:val="en-US"/>
         </w:rPr>
       </w:pPr>
       <w:r>
@@ -811,6 +1739,7 @@
         </w:rPr>
         <w:t>7) Отредактируем файл экспорта /</w:t>
       </w:r>
+      <w:proofErr w:type="spellStart"/>
       <w:r>
         <w:rPr>
           <w:rFonts w:ascii="Times New Roman" w:hAnsi="Times New Roman" w:cs="Times New Roman"/>
@@ -820,6 +1749,7 @@
         </w:rPr>
         <w:t>etc</w:t>
       </w:r>
+      <w:proofErr w:type="spellEnd"/>
       <w:r>
         <w:rPr>
           <w:rFonts w:ascii="Times New Roman" w:hAnsi="Times New Roman" w:cs="Times New Roman"/>
@@ -942,54 +1872,253 @@
           <w:szCs w:val="28"/>
           <w:lang w:val="en-US"/>
         </w:rPr>
-        <w:t>/srv/nfs        172.16.8.169(rw,sync,fsid=0,no_subtree_check,insecure)</w:t>
-      </w:r>
-    </w:p>
-    <w:p>
-      <w:pPr>
-        <w:rPr>
-          <w:rFonts w:ascii="Times New Roman" w:hAnsi="Times New Roman" w:cs="Times New Roman"/>
-          <w:sz w:val="28"/>
-          <w:szCs w:val="28"/>
-          <w:lang w:val="en-US"/>
-        </w:rPr>
-      </w:pPr>
-      <w:r>
-        <w:rPr>
-          <w:rFonts w:ascii="Times New Roman" w:hAnsi="Times New Roman" w:cs="Times New Roman"/>
-          <w:sz w:val="28"/>
-          <w:szCs w:val="28"/>
-          <w:lang w:val="en-US"/>
-        </w:rPr>
-        <w:t>/srv/nfs/snmp   172.16.8.169(rw,sync,no_subtree_check,insecure)</w:t>
-      </w:r>
-    </w:p>
-    <w:p>
-      <w:pPr>
-        <w:rPr>
-          <w:rFonts w:ascii="Times New Roman" w:hAnsi="Times New Roman" w:cs="Times New Roman"/>
-          <w:sz w:val="28"/>
-          <w:szCs w:val="28"/>
-          <w:lang w:val="en-US"/>
-        </w:rPr>
-      </w:pPr>
-      <w:r>
-        <w:rPr>
-          <w:rFonts w:ascii="Times New Roman" w:hAnsi="Times New Roman" w:cs="Times New Roman"/>
-          <w:sz w:val="28"/>
-          <w:szCs w:val="28"/>
-          <w:lang w:val="en-US"/>
-        </w:rPr>
-        <w:t>/srv/nfs/log    172.16.8.169(ro,sync,no_subtree_check,insecure)</w:t>
-      </w:r>
-    </w:p>
-    <w:p>
-      <w:pPr>
-        <w:rPr>
-          <w:rFonts w:ascii="Times New Roman" w:hAnsi="Times New Roman" w:cs="Times New Roman"/>
-          <w:sz w:val="28"/>
-          <w:szCs w:val="28"/>
-          <w:lang w:val="en-US"/>
+        <w:t>/</w:t>
+      </w:r>
+      <w:proofErr w:type="spellStart"/>
+      <w:r>
+        <w:rPr>
+          <w:rFonts w:ascii="Times New Roman" w:hAnsi="Times New Roman" w:cs="Times New Roman"/>
+          <w:sz w:val="28"/>
+          <w:szCs w:val="28"/>
+          <w:lang w:val="en-US"/>
+        </w:rPr>
+        <w:t>srv</w:t>
+      </w:r>
+      <w:proofErr w:type="spellEnd"/>
+      <w:r>
+        <w:rPr>
+          <w:rFonts w:ascii="Times New Roman" w:hAnsi="Times New Roman" w:cs="Times New Roman"/>
+          <w:sz w:val="28"/>
+          <w:szCs w:val="28"/>
+          <w:lang w:val="en-US"/>
+        </w:rPr>
+        <w:t>/</w:t>
+      </w:r>
+      <w:proofErr w:type="spellStart"/>
+      <w:r>
+        <w:rPr>
+          <w:rFonts w:ascii="Times New Roman" w:hAnsi="Times New Roman" w:cs="Times New Roman"/>
+          <w:sz w:val="28"/>
+          <w:szCs w:val="28"/>
+          <w:lang w:val="en-US"/>
+        </w:rPr>
+        <w:t>nfs</w:t>
+      </w:r>
+      <w:proofErr w:type="spellEnd"/>
+      <w:r>
+        <w:rPr>
+          <w:rFonts w:ascii="Times New Roman" w:hAnsi="Times New Roman" w:cs="Times New Roman"/>
+          <w:sz w:val="28"/>
+          <w:szCs w:val="28"/>
+          <w:lang w:val="en-US"/>
+        </w:rPr>
+        <w:t xml:space="preserve">        172.16.8.169(</w:t>
+      </w:r>
+      <w:proofErr w:type="spellStart"/>
+      <w:r>
+        <w:rPr>
+          <w:rFonts w:ascii="Times New Roman" w:hAnsi="Times New Roman" w:cs="Times New Roman"/>
+          <w:sz w:val="28"/>
+          <w:szCs w:val="28"/>
+          <w:lang w:val="en-US"/>
+        </w:rPr>
+        <w:t>rw,sync,fsid</w:t>
+      </w:r>
+      <w:proofErr w:type="spellEnd"/>
+      <w:r>
+        <w:rPr>
+          <w:rFonts w:ascii="Times New Roman" w:hAnsi="Times New Roman" w:cs="Times New Roman"/>
+          <w:sz w:val="28"/>
+          <w:szCs w:val="28"/>
+          <w:lang w:val="en-US"/>
+        </w:rPr>
+        <w:t>=0,no_subtree_check,insecure)</w:t>
+      </w:r>
+    </w:p>
+    <w:p>
+      <w:pPr>
+        <w:rPr>
+          <w:rFonts w:ascii="Times New Roman" w:hAnsi="Times New Roman" w:cs="Times New Roman"/>
+          <w:sz w:val="28"/>
+          <w:szCs w:val="28"/>
+          <w:lang w:val="en-US"/>
+        </w:rPr>
+      </w:pPr>
+      <w:r>
+        <w:rPr>
+          <w:rFonts w:ascii="Times New Roman" w:hAnsi="Times New Roman" w:cs="Times New Roman"/>
+          <w:sz w:val="28"/>
+          <w:szCs w:val="28"/>
+          <w:lang w:val="en-US"/>
+        </w:rPr>
+        <w:t>/</w:t>
+      </w:r>
+      <w:proofErr w:type="spellStart"/>
+      <w:r>
+        <w:rPr>
+          <w:rFonts w:ascii="Times New Roman" w:hAnsi="Times New Roman" w:cs="Times New Roman"/>
+          <w:sz w:val="28"/>
+          <w:szCs w:val="28"/>
+          <w:lang w:val="en-US"/>
+        </w:rPr>
+        <w:t>srv</w:t>
+      </w:r>
+      <w:proofErr w:type="spellEnd"/>
+      <w:r>
+        <w:rPr>
+          <w:rFonts w:ascii="Times New Roman" w:hAnsi="Times New Roman" w:cs="Times New Roman"/>
+          <w:sz w:val="28"/>
+          <w:szCs w:val="28"/>
+          <w:lang w:val="en-US"/>
+        </w:rPr>
+        <w:t>/</w:t>
+      </w:r>
+      <w:proofErr w:type="spellStart"/>
+      <w:r>
+        <w:rPr>
+          <w:rFonts w:ascii="Times New Roman" w:hAnsi="Times New Roman" w:cs="Times New Roman"/>
+          <w:sz w:val="28"/>
+          <w:szCs w:val="28"/>
+          <w:lang w:val="en-US"/>
+        </w:rPr>
+        <w:t>nfs</w:t>
+      </w:r>
+      <w:proofErr w:type="spellEnd"/>
+      <w:r>
+        <w:rPr>
+          <w:rFonts w:ascii="Times New Roman" w:hAnsi="Times New Roman" w:cs="Times New Roman"/>
+          <w:sz w:val="28"/>
+          <w:szCs w:val="28"/>
+          <w:lang w:val="en-US"/>
+        </w:rPr>
+        <w:t>/</w:t>
+      </w:r>
+      <w:proofErr w:type="spellStart"/>
+      <w:r>
+        <w:rPr>
+          <w:rFonts w:ascii="Times New Roman" w:hAnsi="Times New Roman" w:cs="Times New Roman"/>
+          <w:sz w:val="28"/>
+          <w:szCs w:val="28"/>
+          <w:lang w:val="en-US"/>
+        </w:rPr>
+        <w:t>snmp</w:t>
+      </w:r>
+      <w:proofErr w:type="spellEnd"/>
+      <w:r>
+        <w:rPr>
+          <w:rFonts w:ascii="Times New Roman" w:hAnsi="Times New Roman" w:cs="Times New Roman"/>
+          <w:sz w:val="28"/>
+          <w:szCs w:val="28"/>
+          <w:lang w:val="en-US"/>
+        </w:rPr>
+        <w:t xml:space="preserve">   172.16.8.169(</w:t>
+      </w:r>
+      <w:proofErr w:type="spellStart"/>
+      <w:r>
+        <w:rPr>
+          <w:rFonts w:ascii="Times New Roman" w:hAnsi="Times New Roman" w:cs="Times New Roman"/>
+          <w:sz w:val="28"/>
+          <w:szCs w:val="28"/>
+          <w:lang w:val="en-US"/>
+        </w:rPr>
+        <w:t>rw,sync,no_subtree_check,insecure</w:t>
+      </w:r>
+      <w:proofErr w:type="spellEnd"/>
+      <w:r>
+        <w:rPr>
+          <w:rFonts w:ascii="Times New Roman" w:hAnsi="Times New Roman" w:cs="Times New Roman"/>
+          <w:sz w:val="28"/>
+          <w:szCs w:val="28"/>
+          <w:lang w:val="en-US"/>
+        </w:rPr>
+        <w:t>)</w:t>
+      </w:r>
+    </w:p>
+    <w:p>
+      <w:pPr>
+        <w:rPr>
+          <w:rFonts w:ascii="Times New Roman" w:hAnsi="Times New Roman" w:cs="Times New Roman"/>
+          <w:sz w:val="28"/>
+          <w:szCs w:val="28"/>
+          <w:lang w:val="en-US"/>
+        </w:rPr>
+      </w:pPr>
+      <w:r>
+        <w:rPr>
+          <w:rFonts w:ascii="Times New Roman" w:hAnsi="Times New Roman" w:cs="Times New Roman"/>
+          <w:sz w:val="28"/>
+          <w:szCs w:val="28"/>
+          <w:lang w:val="en-US"/>
+        </w:rPr>
+        <w:t>/</w:t>
+      </w:r>
+      <w:proofErr w:type="spellStart"/>
+      <w:r>
+        <w:rPr>
+          <w:rFonts w:ascii="Times New Roman" w:hAnsi="Times New Roman" w:cs="Times New Roman"/>
+          <w:sz w:val="28"/>
+          <w:szCs w:val="28"/>
+          <w:lang w:val="en-US"/>
+        </w:rPr>
+        <w:t>srv</w:t>
+      </w:r>
+      <w:proofErr w:type="spellEnd"/>
+      <w:r>
+        <w:rPr>
+          <w:rFonts w:ascii="Times New Roman" w:hAnsi="Times New Roman" w:cs="Times New Roman"/>
+          <w:sz w:val="28"/>
+          <w:szCs w:val="28"/>
+          <w:lang w:val="en-US"/>
+        </w:rPr>
+        <w:t>/</w:t>
+      </w:r>
+      <w:proofErr w:type="spellStart"/>
+      <w:r>
+        <w:rPr>
+          <w:rFonts w:ascii="Times New Roman" w:hAnsi="Times New Roman" w:cs="Times New Roman"/>
+          <w:sz w:val="28"/>
+          <w:szCs w:val="28"/>
+          <w:lang w:val="en-US"/>
+        </w:rPr>
+        <w:t>nfs</w:t>
+      </w:r>
+      <w:proofErr w:type="spellEnd"/>
+      <w:r>
+        <w:rPr>
+          <w:rFonts w:ascii="Times New Roman" w:hAnsi="Times New Roman" w:cs="Times New Roman"/>
+          <w:sz w:val="28"/>
+          <w:szCs w:val="28"/>
+          <w:lang w:val="en-US"/>
+        </w:rPr>
+        <w:t>/log    172.16.8.169(</w:t>
+      </w:r>
+      <w:proofErr w:type="spellStart"/>
+      <w:r>
+        <w:rPr>
+          <w:rFonts w:ascii="Times New Roman" w:hAnsi="Times New Roman" w:cs="Times New Roman"/>
+          <w:sz w:val="28"/>
+          <w:szCs w:val="28"/>
+          <w:lang w:val="en-US"/>
+        </w:rPr>
+        <w:t>ro,sync,no_subtree_check,insecure</w:t>
+      </w:r>
+      <w:proofErr w:type="spellEnd"/>
+      <w:r>
+        <w:rPr>
+          <w:rFonts w:ascii="Times New Roman" w:hAnsi="Times New Roman" w:cs="Times New Roman"/>
+          <w:sz w:val="28"/>
+          <w:szCs w:val="28"/>
+          <w:lang w:val="en-US"/>
+        </w:rPr>
+        <w:t>)</w:t>
+      </w:r>
+    </w:p>
+    <w:p>
+      <w:pPr>
+        <w:rPr>
+          <w:rFonts w:ascii="Times New Roman" w:hAnsi="Times New Roman" w:cs="Times New Roman"/>
+          <w:sz w:val="28"/>
+          <w:szCs w:val="28"/>
         </w:rPr>
       </w:pPr>
       <w:r>
@@ -1007,7 +2136,6 @@
           <w:rFonts w:ascii="Times New Roman" w:hAnsi="Times New Roman" w:cs="Times New Roman"/>
           <w:sz w:val="28"/>
           <w:szCs w:val="28"/>
-          <w:lang w:val="en-US"/>
         </w:rPr>
       </w:pPr>
       <w:r>
@@ -1085,7 +2213,95 @@
           <w:sz w:val="28"/>
           <w:szCs w:val="28"/>
         </w:rPr>
-        <w:t>III) Ограничить доступ к портам службы rpcbind на сервере для первой практики, разрешив доступ только для ip адреса сервера второй практики и запретив для прочих используя firewall (не забудьте разрешить доступ по ssh).</w:t>
+        <w:t xml:space="preserve">III) Ограничить доступ к портам службы </w:t>
+      </w:r>
+      <w:proofErr w:type="spellStart"/>
+      <w:r>
+        <w:rPr>
+          <w:rFonts w:ascii="Times New Roman" w:hAnsi="Times New Roman" w:cs="Times New Roman"/>
+          <w:b/>
+          <w:bCs/>
+          <w:sz w:val="28"/>
+          <w:szCs w:val="28"/>
+        </w:rPr>
+        <w:t>rpcbind</w:t>
+      </w:r>
+      <w:proofErr w:type="spellEnd"/>
+      <w:r>
+        <w:rPr>
+          <w:rFonts w:ascii="Times New Roman" w:hAnsi="Times New Roman" w:cs="Times New Roman"/>
+          <w:b/>
+          <w:bCs/>
+          <w:sz w:val="28"/>
+          <w:szCs w:val="28"/>
+        </w:rPr>
+        <w:t xml:space="preserve"> на сервере для первой практики, разрешив доступ только для </w:t>
+      </w:r>
+      <w:proofErr w:type="spellStart"/>
+      <w:r>
+        <w:rPr>
+          <w:rFonts w:ascii="Times New Roman" w:hAnsi="Times New Roman" w:cs="Times New Roman"/>
+          <w:b/>
+          <w:bCs/>
+          <w:sz w:val="28"/>
+          <w:szCs w:val="28"/>
+        </w:rPr>
+        <w:t>ip</w:t>
+      </w:r>
+      <w:proofErr w:type="spellEnd"/>
+      <w:r>
+        <w:rPr>
+          <w:rFonts w:ascii="Times New Roman" w:hAnsi="Times New Roman" w:cs="Times New Roman"/>
+          <w:b/>
+          <w:bCs/>
+          <w:sz w:val="28"/>
+          <w:szCs w:val="28"/>
+        </w:rPr>
+        <w:t xml:space="preserve"> адреса сервера второй практики и запретив для прочих используя </w:t>
+      </w:r>
+      <w:proofErr w:type="spellStart"/>
+      <w:r>
+        <w:rPr>
+          <w:rFonts w:ascii="Times New Roman" w:hAnsi="Times New Roman" w:cs="Times New Roman"/>
+          <w:b/>
+          <w:bCs/>
+          <w:sz w:val="28"/>
+          <w:szCs w:val="28"/>
+        </w:rPr>
+        <w:t>firewall</w:t>
+      </w:r>
+      <w:proofErr w:type="spellEnd"/>
+      <w:r>
+        <w:rPr>
+          <w:rFonts w:ascii="Times New Roman" w:hAnsi="Times New Roman" w:cs="Times New Roman"/>
+          <w:b/>
+          <w:bCs/>
+          <w:sz w:val="28"/>
+          <w:szCs w:val="28"/>
+        </w:rPr>
+        <w:t xml:space="preserve"> (не забудьте разрешить доступ по </w:t>
+      </w:r>
+      <w:proofErr w:type="spellStart"/>
+      <w:r>
+        <w:rPr>
+          <w:rFonts w:ascii="Times New Roman" w:hAnsi="Times New Roman" w:cs="Times New Roman"/>
+          <w:b/>
+          <w:bCs/>
+          <w:sz w:val="28"/>
+          <w:szCs w:val="28"/>
+        </w:rPr>
+        <w:t>ssh</w:t>
+      </w:r>
+      <w:proofErr w:type="spellEnd"/>
+      <w:r>
+        <w:rPr>
+          <w:rFonts w:ascii="Times New Roman" w:hAnsi="Times New Roman" w:cs="Times New Roman"/>
+          <w:b/>
+          <w:bCs/>
+          <w:sz w:val="28"/>
+          <w:szCs w:val="28"/>
+        </w:rPr>
+        <w:t>).</w:t>
       </w:r>
     </w:p>
     <w:p>
@@ -1169,34 +2385,51 @@
           <w:sz w:val="28"/>
           <w:szCs w:val="28"/>
         </w:rPr>
+        <w:t xml:space="preserve">9) Разрешим </w:t>
+      </w:r>
+      <w:proofErr w:type="spellStart"/>
+      <w:r>
+        <w:rPr>
+          <w:rFonts w:ascii="Times New Roman" w:hAnsi="Times New Roman" w:cs="Times New Roman"/>
+          <w:sz w:val="28"/>
+          <w:szCs w:val="28"/>
+        </w:rPr>
+        <w:t>rpcbind</w:t>
+      </w:r>
+      <w:proofErr w:type="spellEnd"/>
+      <w:r>
+        <w:rPr>
+          <w:rFonts w:ascii="Times New Roman" w:hAnsi="Times New Roman" w:cs="Times New Roman"/>
+          <w:sz w:val="28"/>
+          <w:szCs w:val="28"/>
+        </w:rPr>
+        <w:t xml:space="preserve"> (порт 111) ТОЛЬКО для сервера второй практики:</w:t>
+      </w:r>
+    </w:p>
+    <w:p>
+      <w:pPr>
+        <w:rPr>
+          <w:rFonts w:ascii="Times New Roman" w:hAnsi="Times New Roman" w:cs="Times New Roman"/>
+          <w:sz w:val="28"/>
+          <w:szCs w:val="28"/>
+        </w:rPr>
+      </w:pPr>
+    </w:p>
+    <w:p>
+      <w:pPr>
+        <w:rPr>
+          <w:rFonts w:ascii="Times New Roman" w:hAnsi="Times New Roman" w:cs="Times New Roman"/>
+          <w:sz w:val="28"/>
+          <w:szCs w:val="28"/>
+        </w:rPr>
+      </w:pPr>
+      <w:r>
+        <w:rPr>
+          <w:rFonts w:ascii="Times New Roman" w:hAnsi="Times New Roman" w:cs="Times New Roman"/>
+          <w:sz w:val="28"/>
+          <w:szCs w:val="28"/>
+        </w:rPr>
         <w:lastRenderedPageBreak/>
-        <w:t>9) Разрешим rpcbind (порт 111) ТОЛЬКО для сервера второй практики:</w:t>
-      </w:r>
-    </w:p>
-    <w:p>
-      <w:pPr>
-        <w:rPr>
-          <w:rFonts w:ascii="Times New Roman" w:hAnsi="Times New Roman" w:cs="Times New Roman"/>
-          <w:sz w:val="28"/>
-          <w:szCs w:val="28"/>
-          <w:lang w:val="en-US"/>
-        </w:rPr>
-      </w:pPr>
-    </w:p>
-    <w:p>
-      <w:pPr>
-        <w:rPr>
-          <w:rFonts w:ascii="Times New Roman" w:hAnsi="Times New Roman" w:cs="Times New Roman"/>
-          <w:sz w:val="28"/>
-          <w:szCs w:val="28"/>
-        </w:rPr>
-      </w:pPr>
-      <w:r>
-        <w:rPr>
-          <w:rFonts w:ascii="Times New Roman" w:hAnsi="Times New Roman" w:cs="Times New Roman"/>
-          <w:sz w:val="28"/>
-          <w:szCs w:val="28"/>
-        </w:rPr>
         <w:t>Разреши</w:t>
       </w:r>
       <w:r>
@@ -1361,7 +2594,25 @@
           <w:sz w:val="28"/>
           <w:szCs w:val="28"/>
         </w:rPr>
-        <w:t>10) Запретим rpcbind (порт 111) для ВСЕХ остальных:</w:t>
+        <w:t xml:space="preserve">10) Запретим </w:t>
+      </w:r>
+      <w:proofErr w:type="spellStart"/>
+      <w:r>
+        <w:rPr>
+          <w:rFonts w:ascii="Times New Roman" w:hAnsi="Times New Roman" w:cs="Times New Roman"/>
+          <w:sz w:val="28"/>
+          <w:szCs w:val="28"/>
+        </w:rPr>
+        <w:t>rpcbind</w:t>
+      </w:r>
+      <w:proofErr w:type="spellEnd"/>
+      <w:r>
+        <w:rPr>
+          <w:rFonts w:ascii="Times New Roman" w:hAnsi="Times New Roman" w:cs="Times New Roman"/>
+          <w:sz w:val="28"/>
+          <w:szCs w:val="28"/>
+        </w:rPr>
+        <w:t xml:space="preserve"> (порт 111) для ВСЕХ остальных:</w:t>
       </w:r>
     </w:p>
     <w:p>
@@ -1808,7 +3059,6 @@
         <w:rPr>
           <w:noProof/>
         </w:rPr>
-        <w:lastRenderedPageBreak/>
         <w:drawing>
           <wp:inline distT="0" distB="0" distL="0" distR="0" wp14:anchorId="731DE2D6" wp14:editId="5C9423C7">
             <wp:extent cx="4371975" cy="3133725"/>
@@ -1854,7 +3104,6 @@
           <w:bCs/>
           <w:sz w:val="28"/>
           <w:szCs w:val="28"/>
-          <w:lang w:val="en-US"/>
         </w:rPr>
       </w:pPr>
       <w:r>
@@ -1865,7 +3114,250 @@
           <w:sz w:val="28"/>
           <w:szCs w:val="28"/>
         </w:rPr>
-        <w:t>IV) Выполнить на сервере для второй практики с использованием клиента протокола NFS v4 монтирование в каталог /mnt/${srv_practice1}/snmp каталога /srv/nfs/snmp с сервера для первой практики, и, аналогично, в каталог /mnt/${srv_practice1}/log  выполнить монтирование каталога /srv/nfs/log. Значение переменной выше по тексту замените на имя сервера для первой практики, выяснив его при помощи команды hostname.</w:t>
+        <w:lastRenderedPageBreak/>
+        <w:t>IV) Выполнить на сервере для второй практики с использованием клиента протокола NFS v4 монтирование в каталог /</w:t>
+      </w:r>
+      <w:proofErr w:type="spellStart"/>
+      <w:r>
+        <w:rPr>
+          <w:rFonts w:ascii="Times New Roman" w:hAnsi="Times New Roman" w:cs="Times New Roman"/>
+          <w:b/>
+          <w:bCs/>
+          <w:sz w:val="28"/>
+          <w:szCs w:val="28"/>
+        </w:rPr>
+        <w:t>mnt</w:t>
+      </w:r>
+      <w:proofErr w:type="spellEnd"/>
+      <w:r>
+        <w:rPr>
+          <w:rFonts w:ascii="Times New Roman" w:hAnsi="Times New Roman" w:cs="Times New Roman"/>
+          <w:b/>
+          <w:bCs/>
+          <w:sz w:val="28"/>
+          <w:szCs w:val="28"/>
+        </w:rPr>
+        <w:t>/${srv_practice1}/</w:t>
+      </w:r>
+      <w:proofErr w:type="spellStart"/>
+      <w:r>
+        <w:rPr>
+          <w:rFonts w:ascii="Times New Roman" w:hAnsi="Times New Roman" w:cs="Times New Roman"/>
+          <w:b/>
+          <w:bCs/>
+          <w:sz w:val="28"/>
+          <w:szCs w:val="28"/>
+        </w:rPr>
+        <w:t>snmp</w:t>
+      </w:r>
+      <w:proofErr w:type="spellEnd"/>
+      <w:r>
+        <w:rPr>
+          <w:rFonts w:ascii="Times New Roman" w:hAnsi="Times New Roman" w:cs="Times New Roman"/>
+          <w:b/>
+          <w:bCs/>
+          <w:sz w:val="28"/>
+          <w:szCs w:val="28"/>
+        </w:rPr>
+        <w:t xml:space="preserve"> каталога /</w:t>
+      </w:r>
+      <w:proofErr w:type="spellStart"/>
+      <w:r>
+        <w:rPr>
+          <w:rFonts w:ascii="Times New Roman" w:hAnsi="Times New Roman" w:cs="Times New Roman"/>
+          <w:b/>
+          <w:bCs/>
+          <w:sz w:val="28"/>
+          <w:szCs w:val="28"/>
+        </w:rPr>
+        <w:t>srv</w:t>
+      </w:r>
+      <w:proofErr w:type="spellEnd"/>
+      <w:r>
+        <w:rPr>
+          <w:rFonts w:ascii="Times New Roman" w:hAnsi="Times New Roman" w:cs="Times New Roman"/>
+          <w:b/>
+          <w:bCs/>
+          <w:sz w:val="28"/>
+          <w:szCs w:val="28"/>
+        </w:rPr>
+        <w:t>/</w:t>
+      </w:r>
+      <w:proofErr w:type="spellStart"/>
+      <w:r>
+        <w:rPr>
+          <w:rFonts w:ascii="Times New Roman" w:hAnsi="Times New Roman" w:cs="Times New Roman"/>
+          <w:b/>
+          <w:bCs/>
+          <w:sz w:val="28"/>
+          <w:szCs w:val="28"/>
+        </w:rPr>
+        <w:t>nfs</w:t>
+      </w:r>
+      <w:proofErr w:type="spellEnd"/>
+      <w:r>
+        <w:rPr>
+          <w:rFonts w:ascii="Times New Roman" w:hAnsi="Times New Roman" w:cs="Times New Roman"/>
+          <w:b/>
+          <w:bCs/>
+          <w:sz w:val="28"/>
+          <w:szCs w:val="28"/>
+        </w:rPr>
+        <w:t>/</w:t>
+      </w:r>
+      <w:proofErr w:type="spellStart"/>
+      <w:r>
+        <w:rPr>
+          <w:rFonts w:ascii="Times New Roman" w:hAnsi="Times New Roman" w:cs="Times New Roman"/>
+          <w:b/>
+          <w:bCs/>
+          <w:sz w:val="28"/>
+          <w:szCs w:val="28"/>
+        </w:rPr>
+        <w:t>snmp</w:t>
+      </w:r>
+      <w:proofErr w:type="spellEnd"/>
+      <w:r>
+        <w:rPr>
+          <w:rFonts w:ascii="Times New Roman" w:hAnsi="Times New Roman" w:cs="Times New Roman"/>
+          <w:b/>
+          <w:bCs/>
+          <w:sz w:val="28"/>
+          <w:szCs w:val="28"/>
+        </w:rPr>
+        <w:t xml:space="preserve"> с сервера для первой практики, и, аналогично, в каталог /</w:t>
+      </w:r>
+      <w:proofErr w:type="spellStart"/>
+      <w:r>
+        <w:rPr>
+          <w:rFonts w:ascii="Times New Roman" w:hAnsi="Times New Roman" w:cs="Times New Roman"/>
+          <w:b/>
+          <w:bCs/>
+          <w:sz w:val="28"/>
+          <w:szCs w:val="28"/>
+        </w:rPr>
+        <w:t>mnt</w:t>
+      </w:r>
+      <w:proofErr w:type="spellEnd"/>
+      <w:r>
+        <w:rPr>
+          <w:rFonts w:ascii="Times New Roman" w:hAnsi="Times New Roman" w:cs="Times New Roman"/>
+          <w:b/>
+          <w:bCs/>
+          <w:sz w:val="28"/>
+          <w:szCs w:val="28"/>
+        </w:rPr>
+        <w:t>/${srv_practice1}/</w:t>
+      </w:r>
+      <w:proofErr w:type="spellStart"/>
+      <w:r>
+        <w:rPr>
+          <w:rFonts w:ascii="Times New Roman" w:hAnsi="Times New Roman" w:cs="Times New Roman"/>
+          <w:b/>
+          <w:bCs/>
+          <w:sz w:val="28"/>
+          <w:szCs w:val="28"/>
+        </w:rPr>
+        <w:t>log</w:t>
+      </w:r>
+      <w:proofErr w:type="spellEnd"/>
+      <w:r>
+        <w:rPr>
+          <w:rFonts w:ascii="Times New Roman" w:hAnsi="Times New Roman" w:cs="Times New Roman"/>
+          <w:b/>
+          <w:bCs/>
+          <w:sz w:val="28"/>
+          <w:szCs w:val="28"/>
+        </w:rPr>
+        <w:t xml:space="preserve">  выполнить монтирование каталога /</w:t>
+      </w:r>
+      <w:proofErr w:type="spellStart"/>
+      <w:r>
+        <w:rPr>
+          <w:rFonts w:ascii="Times New Roman" w:hAnsi="Times New Roman" w:cs="Times New Roman"/>
+          <w:b/>
+          <w:bCs/>
+          <w:sz w:val="28"/>
+          <w:szCs w:val="28"/>
+        </w:rPr>
+        <w:t>srv</w:t>
+      </w:r>
+      <w:proofErr w:type="spellEnd"/>
+      <w:r>
+        <w:rPr>
+          <w:rFonts w:ascii="Times New Roman" w:hAnsi="Times New Roman" w:cs="Times New Roman"/>
+          <w:b/>
+          <w:bCs/>
+          <w:sz w:val="28"/>
+          <w:szCs w:val="28"/>
+        </w:rPr>
+        <w:t>/</w:t>
+      </w:r>
+      <w:proofErr w:type="spellStart"/>
+      <w:r>
+        <w:rPr>
+          <w:rFonts w:ascii="Times New Roman" w:hAnsi="Times New Roman" w:cs="Times New Roman"/>
+          <w:b/>
+          <w:bCs/>
+          <w:sz w:val="28"/>
+          <w:szCs w:val="28"/>
+        </w:rPr>
+        <w:t>nfs</w:t>
+      </w:r>
+      <w:proofErr w:type="spellEnd"/>
+      <w:r>
+        <w:rPr>
+          <w:rFonts w:ascii="Times New Roman" w:hAnsi="Times New Roman" w:cs="Times New Roman"/>
+          <w:b/>
+          <w:bCs/>
+          <w:sz w:val="28"/>
+          <w:szCs w:val="28"/>
+        </w:rPr>
+        <w:t>/</w:t>
+      </w:r>
+      <w:proofErr w:type="spellStart"/>
+      <w:r>
+        <w:rPr>
+          <w:rFonts w:ascii="Times New Roman" w:hAnsi="Times New Roman" w:cs="Times New Roman"/>
+          <w:b/>
+          <w:bCs/>
+          <w:sz w:val="28"/>
+          <w:szCs w:val="28"/>
+        </w:rPr>
+        <w:t>log</w:t>
+      </w:r>
+      <w:proofErr w:type="spellEnd"/>
+      <w:r>
+        <w:rPr>
+          <w:rFonts w:ascii="Times New Roman" w:hAnsi="Times New Roman" w:cs="Times New Roman"/>
+          <w:b/>
+          <w:bCs/>
+          <w:sz w:val="28"/>
+          <w:szCs w:val="28"/>
+        </w:rPr>
+        <w:t xml:space="preserve">. Значение переменной выше по тексту замените на имя сервера для первой практики, выяснив его при помощи команды </w:t>
+      </w:r>
+      <w:proofErr w:type="spellStart"/>
+      <w:r>
+        <w:rPr>
+          <w:rFonts w:ascii="Times New Roman" w:hAnsi="Times New Roman" w:cs="Times New Roman"/>
+          <w:b/>
+          <w:bCs/>
+          <w:sz w:val="28"/>
+          <w:szCs w:val="28"/>
+        </w:rPr>
+        <w:t>hostname</w:t>
+      </w:r>
+      <w:proofErr w:type="spellEnd"/>
+      <w:r>
+        <w:rPr>
+          <w:rFonts w:ascii="Times New Roman" w:hAnsi="Times New Roman" w:cs="Times New Roman"/>
+          <w:b/>
+          <w:bCs/>
+          <w:sz w:val="28"/>
+          <w:szCs w:val="28"/>
+        </w:rPr>
+        <w:t>.</w:t>
       </w:r>
     </w:p>
     <w:p>
@@ -1937,7 +3429,27 @@
           <w:szCs w:val="28"/>
           <w:lang w:val="en-US"/>
         </w:rPr>
-        <w:t xml:space="preserve"> nfs-common:</w:t>
+        <w:t xml:space="preserve"> </w:t>
+      </w:r>
+      <w:proofErr w:type="spellStart"/>
+      <w:r>
+        <w:rPr>
+          <w:rFonts w:ascii="Times New Roman" w:hAnsi="Times New Roman" w:cs="Times New Roman"/>
+          <w:sz w:val="28"/>
+          <w:szCs w:val="28"/>
+          <w:lang w:val="en-US"/>
+        </w:rPr>
+        <w:t>nfs</w:t>
+      </w:r>
+      <w:proofErr w:type="spellEnd"/>
+      <w:r>
+        <w:rPr>
+          <w:rFonts w:ascii="Times New Roman" w:hAnsi="Times New Roman" w:cs="Times New Roman"/>
+          <w:sz w:val="28"/>
+          <w:szCs w:val="28"/>
+          <w:lang w:val="en-US"/>
+        </w:rPr>
+        <w:t>-common:</w:t>
       </w:r>
     </w:p>
     <w:p>
@@ -2237,7 +3749,6 @@
           <w:rFonts w:ascii="Times New Roman" w:hAnsi="Times New Roman" w:cs="Times New Roman"/>
           <w:sz w:val="28"/>
           <w:szCs w:val="28"/>
-          <w:lang w:val="en-US"/>
         </w:rPr>
       </w:pPr>
       <w:r>
@@ -2255,17 +3766,51 @@
           <w:rFonts w:ascii="Times New Roman" w:hAnsi="Times New Roman" w:cs="Times New Roman"/>
           <w:sz w:val="28"/>
           <w:szCs w:val="28"/>
-          <w:lang w:val="en-US"/>
-        </w:rPr>
-      </w:pPr>
-      <w:r>
-        <w:rPr>
-          <w:rFonts w:ascii="Times New Roman" w:hAnsi="Times New Roman" w:cs="Times New Roman"/>
-          <w:sz w:val="28"/>
-          <w:szCs w:val="28"/>
-        </w:rPr>
-        <w:lastRenderedPageBreak/>
-        <w:t>Должны увидеть файлы из /etc/snmp на сервере</w:t>
+        </w:rPr>
+      </w:pPr>
+      <w:r>
+        <w:rPr>
+          <w:rFonts w:ascii="Times New Roman" w:hAnsi="Times New Roman" w:cs="Times New Roman"/>
+          <w:sz w:val="28"/>
+          <w:szCs w:val="28"/>
+        </w:rPr>
+        <w:t>Должны увидеть файлы из /</w:t>
+      </w:r>
+      <w:proofErr w:type="spellStart"/>
+      <w:r>
+        <w:rPr>
+          <w:rFonts w:ascii="Times New Roman" w:hAnsi="Times New Roman" w:cs="Times New Roman"/>
+          <w:sz w:val="28"/>
+          <w:szCs w:val="28"/>
+        </w:rPr>
+        <w:t>etc</w:t>
+      </w:r>
+      <w:proofErr w:type="spellEnd"/>
+      <w:r>
+        <w:rPr>
+          <w:rFonts w:ascii="Times New Roman" w:hAnsi="Times New Roman" w:cs="Times New Roman"/>
+          <w:sz w:val="28"/>
+          <w:szCs w:val="28"/>
+        </w:rPr>
+        <w:t>/</w:t>
+      </w:r>
+      <w:proofErr w:type="spellStart"/>
+      <w:r>
+        <w:rPr>
+          <w:rFonts w:ascii="Times New Roman" w:hAnsi="Times New Roman" w:cs="Times New Roman"/>
+          <w:sz w:val="28"/>
+          <w:szCs w:val="28"/>
+        </w:rPr>
+        <w:t>snmp</w:t>
+      </w:r>
+      <w:proofErr w:type="spellEnd"/>
+      <w:r>
+        <w:rPr>
+          <w:rFonts w:ascii="Times New Roman" w:hAnsi="Times New Roman" w:cs="Times New Roman"/>
+          <w:sz w:val="28"/>
+          <w:szCs w:val="28"/>
+        </w:rPr>
+        <w:t xml:space="preserve"> на сервере</w:t>
       </w:r>
     </w:p>
     <w:p>
@@ -2331,6 +3876,7 @@
         <w:rPr>
           <w:noProof/>
         </w:rPr>
+        <w:lastRenderedPageBreak/>
         <w:drawing>
           <wp:inline distT="0" distB="0" distL="0" distR="0" wp14:anchorId="623C6446" wp14:editId="41DFBDDA">
             <wp:extent cx="5229225" cy="3790950"/>
@@ -2382,15 +3928,25 @@
           <w:sz w:val="28"/>
           <w:szCs w:val="28"/>
         </w:rPr>
-        <w:t>Проверка записи в snmp (должно быть успешно)</w:t>
-      </w:r>
-      <w:r>
-        <w:rPr>
-          <w:rFonts w:ascii="Times New Roman" w:hAnsi="Times New Roman" w:cs="Times New Roman"/>
-          <w:sz w:val="28"/>
-          <w:szCs w:val="28"/>
-        </w:rPr>
-        <w:t>:</w:t>
+        <w:t xml:space="preserve">Проверка записи в </w:t>
+      </w:r>
+      <w:proofErr w:type="spellStart"/>
+      <w:r>
+        <w:rPr>
+          <w:rFonts w:ascii="Times New Roman" w:hAnsi="Times New Roman" w:cs="Times New Roman"/>
+          <w:sz w:val="28"/>
+          <w:szCs w:val="28"/>
+        </w:rPr>
+        <w:t>snmp</w:t>
+      </w:r>
+      <w:proofErr w:type="spellEnd"/>
+      <w:r>
+        <w:rPr>
+          <w:rFonts w:ascii="Times New Roman" w:hAnsi="Times New Roman" w:cs="Times New Roman"/>
+          <w:sz w:val="28"/>
+          <w:szCs w:val="28"/>
+        </w:rPr>
+        <w:t xml:space="preserve"> (должно быть успешно):</w:t>
       </w:r>
     </w:p>
     <w:p>
@@ -2457,7 +4013,25 @@
           <w:sz w:val="28"/>
           <w:szCs w:val="28"/>
         </w:rPr>
-        <w:t>Проверка только чтения для log (должна быть ошибка)</w:t>
+        <w:t xml:space="preserve">Проверка только чтения для </w:t>
+      </w:r>
+      <w:proofErr w:type="spellStart"/>
+      <w:r>
+        <w:rPr>
+          <w:rFonts w:ascii="Times New Roman" w:hAnsi="Times New Roman" w:cs="Times New Roman"/>
+          <w:sz w:val="28"/>
+          <w:szCs w:val="28"/>
+        </w:rPr>
+        <w:t>log</w:t>
+      </w:r>
+      <w:proofErr w:type="spellEnd"/>
+      <w:r>
+        <w:rPr>
+          <w:rFonts w:ascii="Times New Roman" w:hAnsi="Times New Roman" w:cs="Times New Roman"/>
+          <w:sz w:val="28"/>
+          <w:szCs w:val="28"/>
+        </w:rPr>
+        <w:t xml:space="preserve"> (должна быть ошибка)</w:t>
       </w:r>
     </w:p>
     <w:p>
@@ -2516,16 +4090,51 @@
           <w:rFonts w:ascii="Times New Roman" w:hAnsi="Times New Roman" w:cs="Times New Roman"/>
           <w:sz w:val="28"/>
           <w:szCs w:val="28"/>
-          <w:lang w:val="en-US"/>
-        </w:rPr>
-      </w:pPr>
-      <w:r>
-        <w:rPr>
-          <w:rFonts w:ascii="Times New Roman" w:hAnsi="Times New Roman" w:cs="Times New Roman"/>
-          <w:sz w:val="28"/>
-          <w:szCs w:val="28"/>
-        </w:rPr>
-        <w:t>5) Добавим запись в /etc/fstab чтобы монтирование восстанавливалось после ребута:</w:t>
+        </w:rPr>
+      </w:pPr>
+      <w:r>
+        <w:rPr>
+          <w:rFonts w:ascii="Times New Roman" w:hAnsi="Times New Roman" w:cs="Times New Roman"/>
+          <w:sz w:val="28"/>
+          <w:szCs w:val="28"/>
+        </w:rPr>
+        <w:t>5) Добавим запись в /</w:t>
+      </w:r>
+      <w:proofErr w:type="spellStart"/>
+      <w:r>
+        <w:rPr>
+          <w:rFonts w:ascii="Times New Roman" w:hAnsi="Times New Roman" w:cs="Times New Roman"/>
+          <w:sz w:val="28"/>
+          <w:szCs w:val="28"/>
+        </w:rPr>
+        <w:t>etc</w:t>
+      </w:r>
+      <w:proofErr w:type="spellEnd"/>
+      <w:r>
+        <w:rPr>
+          <w:rFonts w:ascii="Times New Roman" w:hAnsi="Times New Roman" w:cs="Times New Roman"/>
+          <w:sz w:val="28"/>
+          <w:szCs w:val="28"/>
+        </w:rPr>
+        <w:t>/</w:t>
+      </w:r>
+      <w:proofErr w:type="spellStart"/>
+      <w:r>
+        <w:rPr>
+          <w:rFonts w:ascii="Times New Roman" w:hAnsi="Times New Roman" w:cs="Times New Roman"/>
+          <w:sz w:val="28"/>
+          <w:szCs w:val="28"/>
+        </w:rPr>
+        <w:t>fstab</w:t>
+      </w:r>
+      <w:proofErr w:type="spellEnd"/>
+      <w:r>
+        <w:rPr>
+          <w:rFonts w:ascii="Times New Roman" w:hAnsi="Times New Roman" w:cs="Times New Roman"/>
+          <w:sz w:val="28"/>
+          <w:szCs w:val="28"/>
+        </w:rPr>
+        <w:t xml:space="preserve"> чтобы монтирование восстанавливалось после ребута:</w:t>
       </w:r>
     </w:p>
     <w:p>
@@ -2592,7 +4201,6 @@
         <w:rPr>
           <w:noProof/>
         </w:rPr>
-        <w:lastRenderedPageBreak/>
         <w:drawing>
           <wp:inline distT="0" distB="0" distL="0" distR="0" wp14:anchorId="56F4CF19" wp14:editId="5063E6A8">
             <wp:extent cx="5940425" cy="1762760"/>
@@ -2656,7 +4264,6 @@
           <w:bCs/>
           <w:sz w:val="28"/>
           <w:szCs w:val="28"/>
-          <w:lang w:val="en-US"/>
         </w:rPr>
       </w:pPr>
       <w:r>
@@ -2667,6 +4274,7 @@
           <w:sz w:val="28"/>
           <w:szCs w:val="28"/>
         </w:rPr>
+        <w:lastRenderedPageBreak/>
         <w:t>V) Убедиться в доступности файлов для чтения и записи в смонтированных каталогах на сервере для второй практики, в том числе после перезагрузки серверов для первой и второй практики, доступность должна восстанавливаться автоматически.</w:t>
       </w:r>
     </w:p>
@@ -2679,14 +4287,45 @@
           <w:lang w:val="en-US"/>
         </w:rPr>
       </w:pPr>
-      <w:r>
-        <w:rPr>
-          <w:rFonts w:ascii="Times New Roman" w:hAnsi="Times New Roman" w:cs="Times New Roman"/>
-          <w:sz w:val="28"/>
-          <w:szCs w:val="28"/>
-          <w:lang w:val="en-US"/>
-        </w:rPr>
-        <w:t>Перезагрузим оба сервера:</w:t>
+      <w:proofErr w:type="spellStart"/>
+      <w:r>
+        <w:rPr>
+          <w:rFonts w:ascii="Times New Roman" w:hAnsi="Times New Roman" w:cs="Times New Roman"/>
+          <w:sz w:val="28"/>
+          <w:szCs w:val="28"/>
+          <w:lang w:val="en-US"/>
+        </w:rPr>
+        <w:t>Перезагрузим</w:t>
+      </w:r>
+      <w:proofErr w:type="spellEnd"/>
+      <w:r>
+        <w:rPr>
+          <w:rFonts w:ascii="Times New Roman" w:hAnsi="Times New Roman" w:cs="Times New Roman"/>
+          <w:sz w:val="28"/>
+          <w:szCs w:val="28"/>
+          <w:lang w:val="en-US"/>
+        </w:rPr>
+        <w:t xml:space="preserve"> оба </w:t>
+      </w:r>
+      <w:proofErr w:type="spellStart"/>
+      <w:r>
+        <w:rPr>
+          <w:rFonts w:ascii="Times New Roman" w:hAnsi="Times New Roman" w:cs="Times New Roman"/>
+          <w:sz w:val="28"/>
+          <w:szCs w:val="28"/>
+          <w:lang w:val="en-US"/>
+        </w:rPr>
+        <w:t>сервера</w:t>
+      </w:r>
+      <w:proofErr w:type="spellEnd"/>
+      <w:r>
+        <w:rPr>
+          <w:rFonts w:ascii="Times New Roman" w:hAnsi="Times New Roman" w:cs="Times New Roman"/>
+          <w:sz w:val="28"/>
+          <w:szCs w:val="28"/>
+          <w:lang w:val="en-US"/>
+        </w:rPr>
+        <w:t>:</w:t>
       </w:r>
     </w:p>
     <w:p>
@@ -2795,7 +4434,6 @@
           <w:rFonts w:ascii="Times New Roman" w:hAnsi="Times New Roman" w:cs="Times New Roman"/>
           <w:sz w:val="28"/>
           <w:szCs w:val="28"/>
-          <w:lang w:val="en-US"/>
         </w:rPr>
       </w:pPr>
       <w:r>
@@ -3031,6 +4669,7 @@
           <w:sz w:val="28"/>
           <w:szCs w:val="28"/>
         </w:rPr>
+        <w:lastRenderedPageBreak/>
         <w:t>Сложности в процессе</w:t>
       </w:r>
       <w:r>
@@ -3064,7 +4703,25 @@
           <w:sz w:val="28"/>
           <w:szCs w:val="28"/>
         </w:rPr>
-        <w:t>Зависание команды `mount` при монтировании NFS-шары на клиенте Ubuntu</w:t>
+        <w:t>Зависание команды `</w:t>
+      </w:r>
+      <w:proofErr w:type="spellStart"/>
+      <w:r>
+        <w:rPr>
+          <w:rFonts w:ascii="Times New Roman" w:hAnsi="Times New Roman" w:cs="Times New Roman"/>
+          <w:sz w:val="28"/>
+          <w:szCs w:val="28"/>
+        </w:rPr>
+        <w:t>mount</w:t>
+      </w:r>
+      <w:proofErr w:type="spellEnd"/>
+      <w:r>
+        <w:rPr>
+          <w:rFonts w:ascii="Times New Roman" w:hAnsi="Times New Roman" w:cs="Times New Roman"/>
+          <w:sz w:val="28"/>
+          <w:szCs w:val="28"/>
+        </w:rPr>
+        <w:t>` при монтировании NFS-шары на клиенте Ubuntu</w:t>
       </w:r>
     </w:p>
     <w:p>
@@ -3103,7 +4760,97 @@
           <w:sz w:val="28"/>
           <w:szCs w:val="28"/>
         </w:rPr>
-        <w:t>При выполнении команды `sudo mount -t nfs4 172.16.8.149:/snmp /mnt/.../snmp` процесс зависал и не завершался, не выводя никаких сообщений об ошибке.</w:t>
+        <w:t>При выполнении команды `</w:t>
+      </w:r>
+      <w:proofErr w:type="spellStart"/>
+      <w:r>
+        <w:rPr>
+          <w:rFonts w:ascii="Times New Roman" w:hAnsi="Times New Roman" w:cs="Times New Roman"/>
+          <w:sz w:val="28"/>
+          <w:szCs w:val="28"/>
+        </w:rPr>
+        <w:t>sudo</w:t>
+      </w:r>
+      <w:proofErr w:type="spellEnd"/>
+      <w:r>
+        <w:rPr>
+          <w:rFonts w:ascii="Times New Roman" w:hAnsi="Times New Roman" w:cs="Times New Roman"/>
+          <w:sz w:val="28"/>
+          <w:szCs w:val="28"/>
+        </w:rPr>
+        <w:t xml:space="preserve"> </w:t>
+      </w:r>
+      <w:proofErr w:type="spellStart"/>
+      <w:r>
+        <w:rPr>
+          <w:rFonts w:ascii="Times New Roman" w:hAnsi="Times New Roman" w:cs="Times New Roman"/>
+          <w:sz w:val="28"/>
+          <w:szCs w:val="28"/>
+        </w:rPr>
+        <w:t>mount</w:t>
+      </w:r>
+      <w:proofErr w:type="spellEnd"/>
+      <w:r>
+        <w:rPr>
+          <w:rFonts w:ascii="Times New Roman" w:hAnsi="Times New Roman" w:cs="Times New Roman"/>
+          <w:sz w:val="28"/>
+          <w:szCs w:val="28"/>
+        </w:rPr>
+        <w:t xml:space="preserve"> -t nfs4 172.16.8.149:/</w:t>
+      </w:r>
+      <w:proofErr w:type="spellStart"/>
+      <w:r>
+        <w:rPr>
+          <w:rFonts w:ascii="Times New Roman" w:hAnsi="Times New Roman" w:cs="Times New Roman"/>
+          <w:sz w:val="28"/>
+          <w:szCs w:val="28"/>
+        </w:rPr>
+        <w:t>snmp</w:t>
+      </w:r>
+      <w:proofErr w:type="spellEnd"/>
+      <w:r>
+        <w:rPr>
+          <w:rFonts w:ascii="Times New Roman" w:hAnsi="Times New Roman" w:cs="Times New Roman"/>
+          <w:sz w:val="28"/>
+          <w:szCs w:val="28"/>
+        </w:rPr>
+        <w:t xml:space="preserve"> /</w:t>
+      </w:r>
+      <w:proofErr w:type="spellStart"/>
+      <w:r>
+        <w:rPr>
+          <w:rFonts w:ascii="Times New Roman" w:hAnsi="Times New Roman" w:cs="Times New Roman"/>
+          <w:sz w:val="28"/>
+          <w:szCs w:val="28"/>
+        </w:rPr>
+        <w:t>mnt</w:t>
+      </w:r>
+      <w:proofErr w:type="spellEnd"/>
+      <w:r>
+        <w:rPr>
+          <w:rFonts w:ascii="Times New Roman" w:hAnsi="Times New Roman" w:cs="Times New Roman"/>
+          <w:sz w:val="28"/>
+          <w:szCs w:val="28"/>
+        </w:rPr>
+        <w:t>/.../</w:t>
+      </w:r>
+      <w:proofErr w:type="spellStart"/>
+      <w:r>
+        <w:rPr>
+          <w:rFonts w:ascii="Times New Roman" w:hAnsi="Times New Roman" w:cs="Times New Roman"/>
+          <w:sz w:val="28"/>
+          <w:szCs w:val="28"/>
+        </w:rPr>
+        <w:t>snmp</w:t>
+      </w:r>
+      <w:proofErr w:type="spellEnd"/>
+      <w:r>
+        <w:rPr>
+          <w:rFonts w:ascii="Times New Roman" w:hAnsi="Times New Roman" w:cs="Times New Roman"/>
+          <w:sz w:val="28"/>
+          <w:szCs w:val="28"/>
+        </w:rPr>
+        <w:t>` процесс зависал и не завершался, не выводя никаких сообщений об ошибке.</w:t>
       </w:r>
     </w:p>
     <w:p>
@@ -3137,7 +4884,25 @@
           <w:sz w:val="28"/>
           <w:szCs w:val="28"/>
         </w:rPr>
-        <w:t>Клиент Ubuntu 22.04 по умолчанию пытается использовать NFSv4.2, который не поддерживается сервером CentOS 6.10 (поддерживает только NFSv4.0). Процесс автоматического согласования версий зависал.</w:t>
+        <w:t xml:space="preserve">Клиент Ubuntu 22.04 по умолчанию пытается использовать NFSv4.2, который не поддерживается сервером </w:t>
+      </w:r>
+      <w:proofErr w:type="spellStart"/>
+      <w:r>
+        <w:rPr>
+          <w:rFonts w:ascii="Times New Roman" w:hAnsi="Times New Roman" w:cs="Times New Roman"/>
+          <w:sz w:val="28"/>
+          <w:szCs w:val="28"/>
+        </w:rPr>
+        <w:t>CentOS</w:t>
+      </w:r>
+      <w:proofErr w:type="spellEnd"/>
+      <w:r>
+        <w:rPr>
+          <w:rFonts w:ascii="Times New Roman" w:hAnsi="Times New Roman" w:cs="Times New Roman"/>
+          <w:sz w:val="28"/>
+          <w:szCs w:val="28"/>
+        </w:rPr>
+        <w:t xml:space="preserve"> 6.10 (поддерживает только NFSv4.0). Процесс автоматического согласования версий зависал.</w:t>
       </w:r>
     </w:p>
     <w:p>
@@ -3190,6 +4955,7 @@
         </w:rPr>
         <w:t xml:space="preserve"> </w:t>
       </w:r>
+      <w:proofErr w:type="spellStart"/>
       <w:r>
         <w:rPr>
           <w:rFonts w:ascii="Times New Roman" w:hAnsi="Times New Roman" w:cs="Times New Roman"/>
@@ -3199,6 +4965,7 @@
         </w:rPr>
         <w:t>vers</w:t>
       </w:r>
+      <w:proofErr w:type="spellEnd"/>
       <w:r>
         <w:rPr>
           <w:rFonts w:ascii="Times New Roman" w:hAnsi="Times New Roman" w:cs="Times New Roman"/>
@@ -3275,7 +5042,79 @@
           <w:sz w:val="28"/>
           <w:szCs w:val="28"/>
         </w:rPr>
-        <w:t>После указания версии протокола команда монтирования завершалась с ошибкой `No route to host`, хотя сервер был доступен по `ping`.</w:t>
+        <w:t xml:space="preserve">После указания версии протокола команда монтирования завершалась с ошибкой `No </w:t>
+      </w:r>
+      <w:proofErr w:type="spellStart"/>
+      <w:r>
+        <w:rPr>
+          <w:rFonts w:ascii="Times New Roman" w:hAnsi="Times New Roman" w:cs="Times New Roman"/>
+          <w:sz w:val="28"/>
+          <w:szCs w:val="28"/>
+        </w:rPr>
+        <w:t>route</w:t>
+      </w:r>
+      <w:proofErr w:type="spellEnd"/>
+      <w:r>
+        <w:rPr>
+          <w:rFonts w:ascii="Times New Roman" w:hAnsi="Times New Roman" w:cs="Times New Roman"/>
+          <w:sz w:val="28"/>
+          <w:szCs w:val="28"/>
+        </w:rPr>
+        <w:t xml:space="preserve"> </w:t>
+      </w:r>
+      <w:proofErr w:type="spellStart"/>
+      <w:r>
+        <w:rPr>
+          <w:rFonts w:ascii="Times New Roman" w:hAnsi="Times New Roman" w:cs="Times New Roman"/>
+          <w:sz w:val="28"/>
+          <w:szCs w:val="28"/>
+        </w:rPr>
+        <w:t>to</w:t>
+      </w:r>
+      <w:proofErr w:type="spellEnd"/>
+      <w:r>
+        <w:rPr>
+          <w:rFonts w:ascii="Times New Roman" w:hAnsi="Times New Roman" w:cs="Times New Roman"/>
+          <w:sz w:val="28"/>
+          <w:szCs w:val="28"/>
+        </w:rPr>
+        <w:t xml:space="preserve"> </w:t>
+      </w:r>
+      <w:proofErr w:type="spellStart"/>
+      <w:r>
+        <w:rPr>
+          <w:rFonts w:ascii="Times New Roman" w:hAnsi="Times New Roman" w:cs="Times New Roman"/>
+          <w:sz w:val="28"/>
+          <w:szCs w:val="28"/>
+        </w:rPr>
+        <w:t>host</w:t>
+      </w:r>
+      <w:proofErr w:type="spellEnd"/>
+      <w:r>
+        <w:rPr>
+          <w:rFonts w:ascii="Times New Roman" w:hAnsi="Times New Roman" w:cs="Times New Roman"/>
+          <w:sz w:val="28"/>
+          <w:szCs w:val="28"/>
+        </w:rPr>
+        <w:t>`, хотя сервер был доступен по `</w:t>
+      </w:r>
+      <w:proofErr w:type="spellStart"/>
+      <w:r>
+        <w:rPr>
+          <w:rFonts w:ascii="Times New Roman" w:hAnsi="Times New Roman" w:cs="Times New Roman"/>
+          <w:sz w:val="28"/>
+          <w:szCs w:val="28"/>
+        </w:rPr>
+        <w:t>ping</w:t>
+      </w:r>
+      <w:proofErr w:type="spellEnd"/>
+      <w:r>
+        <w:rPr>
+          <w:rFonts w:ascii="Times New Roman" w:hAnsi="Times New Roman" w:cs="Times New Roman"/>
+          <w:sz w:val="28"/>
+          <w:szCs w:val="28"/>
+        </w:rPr>
+        <w:t>`.</w:t>
       </w:r>
     </w:p>
     <w:p>
@@ -3309,7 +5148,61 @@
           <w:sz w:val="28"/>
           <w:szCs w:val="28"/>
         </w:rPr>
-        <w:t>Брандмауэр (iptables) на сервере CentOS блокировал входящие соединения на порт 2049 (NFS). При этом сам сервер NFS работал и слушал порт, что подтверждалось командой `netstat`.</w:t>
+        <w:t>Брандмауэр (</w:t>
+      </w:r>
+      <w:proofErr w:type="spellStart"/>
+      <w:r>
+        <w:rPr>
+          <w:rFonts w:ascii="Times New Roman" w:hAnsi="Times New Roman" w:cs="Times New Roman"/>
+          <w:sz w:val="28"/>
+          <w:szCs w:val="28"/>
+        </w:rPr>
+        <w:t>iptables</w:t>
+      </w:r>
+      <w:proofErr w:type="spellEnd"/>
+      <w:r>
+        <w:rPr>
+          <w:rFonts w:ascii="Times New Roman" w:hAnsi="Times New Roman" w:cs="Times New Roman"/>
+          <w:sz w:val="28"/>
+          <w:szCs w:val="28"/>
+        </w:rPr>
+        <w:t xml:space="preserve">) на сервере </w:t>
+      </w:r>
+      <w:proofErr w:type="spellStart"/>
+      <w:r>
+        <w:rPr>
+          <w:rFonts w:ascii="Times New Roman" w:hAnsi="Times New Roman" w:cs="Times New Roman"/>
+          <w:sz w:val="28"/>
+          <w:szCs w:val="28"/>
+        </w:rPr>
+        <w:t>CentOS</w:t>
+      </w:r>
+      <w:proofErr w:type="spellEnd"/>
+      <w:r>
+        <w:rPr>
+          <w:rFonts w:ascii="Times New Roman" w:hAnsi="Times New Roman" w:cs="Times New Roman"/>
+          <w:sz w:val="28"/>
+          <w:szCs w:val="28"/>
+        </w:rPr>
+        <w:t xml:space="preserve"> блокировал входящие соединения на порт 2049 (NFS). При этом сам сервер NFS работал и слушал порт, что подтверждалось командой `</w:t>
+      </w:r>
+      <w:proofErr w:type="spellStart"/>
+      <w:r>
+        <w:rPr>
+          <w:rFonts w:ascii="Times New Roman" w:hAnsi="Times New Roman" w:cs="Times New Roman"/>
+          <w:sz w:val="28"/>
+          <w:szCs w:val="28"/>
+        </w:rPr>
+        <w:t>netstat</w:t>
+      </w:r>
+      <w:proofErr w:type="spellEnd"/>
+      <w:r>
+        <w:rPr>
+          <w:rFonts w:ascii="Times New Roman" w:hAnsi="Times New Roman" w:cs="Times New Roman"/>
+          <w:sz w:val="28"/>
+          <w:szCs w:val="28"/>
+        </w:rPr>
+        <w:t>`.</w:t>
       </w:r>
     </w:p>
     <w:p>
@@ -3343,43 +5236,495 @@
           <w:sz w:val="28"/>
           <w:szCs w:val="28"/>
         </w:rPr>
+        <w:t xml:space="preserve">Добавление разрешающего правила в </w:t>
+      </w:r>
+      <w:proofErr w:type="spellStart"/>
+      <w:r>
+        <w:rPr>
+          <w:rFonts w:ascii="Times New Roman" w:hAnsi="Times New Roman" w:cs="Times New Roman"/>
+          <w:sz w:val="28"/>
+          <w:szCs w:val="28"/>
+        </w:rPr>
+        <w:t>iptables</w:t>
+      </w:r>
+      <w:proofErr w:type="spellEnd"/>
+      <w:r>
+        <w:rPr>
+          <w:rFonts w:ascii="Times New Roman" w:hAnsi="Times New Roman" w:cs="Times New Roman"/>
+          <w:sz w:val="28"/>
+          <w:szCs w:val="28"/>
+        </w:rPr>
+        <w:t xml:space="preserve"> на сервере </w:t>
+      </w:r>
+      <w:proofErr w:type="spellStart"/>
+      <w:r>
+        <w:rPr>
+          <w:rFonts w:ascii="Times New Roman" w:hAnsi="Times New Roman" w:cs="Times New Roman"/>
+          <w:sz w:val="28"/>
+          <w:szCs w:val="28"/>
+        </w:rPr>
+        <w:t>CentOS</w:t>
+      </w:r>
+      <w:proofErr w:type="spellEnd"/>
+      <w:r>
+        <w:rPr>
+          <w:rFonts w:ascii="Times New Roman" w:hAnsi="Times New Roman" w:cs="Times New Roman"/>
+          <w:sz w:val="28"/>
+          <w:szCs w:val="28"/>
+        </w:rPr>
+        <w:t xml:space="preserve">:  </w:t>
+      </w:r>
+    </w:p>
+    <w:p>
+      <w:pPr>
+        <w:rPr>
+          <w:rFonts w:ascii="Times New Roman" w:hAnsi="Times New Roman" w:cs="Times New Roman"/>
+          <w:sz w:val="28"/>
+          <w:szCs w:val="28"/>
+          <w:lang w:val="en-US"/>
+        </w:rPr>
+      </w:pPr>
+      <w:r>
+        <w:rPr>
+          <w:rFonts w:ascii="Times New Roman" w:hAnsi="Times New Roman" w:cs="Times New Roman"/>
+          <w:sz w:val="28"/>
+          <w:szCs w:val="28"/>
+          <w:lang w:val="en-US"/>
+        </w:rPr>
+        <w:t>`</w:t>
+      </w:r>
+      <w:proofErr w:type="spellStart"/>
+      <w:r>
+        <w:rPr>
+          <w:rFonts w:ascii="Times New Roman" w:hAnsi="Times New Roman" w:cs="Times New Roman"/>
+          <w:sz w:val="28"/>
+          <w:szCs w:val="28"/>
+          <w:lang w:val="en-US"/>
+        </w:rPr>
+        <w:t>sudo</w:t>
+      </w:r>
+      <w:proofErr w:type="spellEnd"/>
+      <w:r>
+        <w:rPr>
+          <w:rFonts w:ascii="Times New Roman" w:hAnsi="Times New Roman" w:cs="Times New Roman"/>
+          <w:sz w:val="28"/>
+          <w:szCs w:val="28"/>
+          <w:lang w:val="en-US"/>
+        </w:rPr>
+        <w:t xml:space="preserve"> iptables -I INPUT -s 172.16.8.169 -p </w:t>
+      </w:r>
+      <w:proofErr w:type="spellStart"/>
+      <w:r>
+        <w:rPr>
+          <w:rFonts w:ascii="Times New Roman" w:hAnsi="Times New Roman" w:cs="Times New Roman"/>
+          <w:sz w:val="28"/>
+          <w:szCs w:val="28"/>
+          <w:lang w:val="en-US"/>
+        </w:rPr>
+        <w:t>tcp</w:t>
+      </w:r>
+      <w:proofErr w:type="spellEnd"/>
+      <w:r>
+        <w:rPr>
+          <w:rFonts w:ascii="Times New Roman" w:hAnsi="Times New Roman" w:cs="Times New Roman"/>
+          <w:sz w:val="28"/>
+          <w:szCs w:val="28"/>
+          <w:lang w:val="en-US"/>
+        </w:rPr>
+        <w:t xml:space="preserve"> --</w:t>
+      </w:r>
+      <w:proofErr w:type="spellStart"/>
+      <w:r>
+        <w:rPr>
+          <w:rFonts w:ascii="Times New Roman" w:hAnsi="Times New Roman" w:cs="Times New Roman"/>
+          <w:sz w:val="28"/>
+          <w:szCs w:val="28"/>
+          <w:lang w:val="en-US"/>
+        </w:rPr>
+        <w:t>dport</w:t>
+      </w:r>
+      <w:proofErr w:type="spellEnd"/>
+      <w:r>
+        <w:rPr>
+          <w:rFonts w:ascii="Times New Roman" w:hAnsi="Times New Roman" w:cs="Times New Roman"/>
+          <w:sz w:val="28"/>
+          <w:szCs w:val="28"/>
+          <w:lang w:val="en-US"/>
+        </w:rPr>
+        <w:t xml:space="preserve"> 2049 -j ACCEPT`</w:t>
+      </w:r>
+    </w:p>
+    <w:p>
+      <w:pPr>
+        <w:rPr>
+          <w:rFonts w:ascii="Times New Roman" w:hAnsi="Times New Roman" w:cs="Times New Roman"/>
+          <w:sz w:val="28"/>
+          <w:szCs w:val="28"/>
+        </w:rPr>
+      </w:pPr>
+      <w:r>
+        <w:rPr>
+          <w:rFonts w:ascii="Times New Roman" w:hAnsi="Times New Roman" w:cs="Times New Roman"/>
+          <w:sz w:val="28"/>
+          <w:szCs w:val="28"/>
+        </w:rPr>
+        <w:t xml:space="preserve">3. Неправильный порядок правил в </w:t>
+      </w:r>
+      <w:proofErr w:type="spellStart"/>
+      <w:r>
+        <w:rPr>
+          <w:rFonts w:ascii="Times New Roman" w:hAnsi="Times New Roman" w:cs="Times New Roman"/>
+          <w:sz w:val="28"/>
+          <w:szCs w:val="28"/>
+        </w:rPr>
+        <w:t>iptables</w:t>
+      </w:r>
+      <w:proofErr w:type="spellEnd"/>
+    </w:p>
+    <w:p>
+      <w:pPr>
+        <w:rPr>
+          <w:rFonts w:ascii="Times New Roman" w:hAnsi="Times New Roman" w:cs="Times New Roman"/>
+          <w:sz w:val="28"/>
+          <w:szCs w:val="28"/>
+        </w:rPr>
+      </w:pPr>
+      <w:r>
+        <w:rPr>
+          <w:rFonts w:ascii="Times New Roman" w:hAnsi="Times New Roman" w:cs="Times New Roman"/>
+          <w:sz w:val="28"/>
+          <w:szCs w:val="28"/>
+        </w:rPr>
+        <w:t xml:space="preserve">Описание: </w:t>
+      </w:r>
+    </w:p>
+    <w:p>
+      <w:pPr>
+        <w:rPr>
+          <w:rFonts w:ascii="Times New Roman" w:hAnsi="Times New Roman" w:cs="Times New Roman"/>
+          <w:sz w:val="28"/>
+          <w:szCs w:val="28"/>
+        </w:rPr>
+      </w:pPr>
+      <w:r>
+        <w:rPr>
+          <w:rFonts w:ascii="Times New Roman" w:hAnsi="Times New Roman" w:cs="Times New Roman"/>
+          <w:sz w:val="28"/>
+          <w:szCs w:val="28"/>
+        </w:rPr>
+        <w:t>После добавления правила для порта 2049 соединение по-прежнему не проходило. Команда `</w:t>
+      </w:r>
+      <w:proofErr w:type="spellStart"/>
+      <w:r>
+        <w:rPr>
+          <w:rFonts w:ascii="Times New Roman" w:hAnsi="Times New Roman" w:cs="Times New Roman"/>
+          <w:sz w:val="28"/>
+          <w:szCs w:val="28"/>
+        </w:rPr>
+        <w:t>nc</w:t>
+      </w:r>
+      <w:proofErr w:type="spellEnd"/>
+      <w:r>
+        <w:rPr>
+          <w:rFonts w:ascii="Times New Roman" w:hAnsi="Times New Roman" w:cs="Times New Roman"/>
+          <w:sz w:val="28"/>
+          <w:szCs w:val="28"/>
+        </w:rPr>
+        <w:t xml:space="preserve"> -</w:t>
+      </w:r>
+      <w:proofErr w:type="spellStart"/>
+      <w:r>
+        <w:rPr>
+          <w:rFonts w:ascii="Times New Roman" w:hAnsi="Times New Roman" w:cs="Times New Roman"/>
+          <w:sz w:val="28"/>
+          <w:szCs w:val="28"/>
+        </w:rPr>
+        <w:t>zv</w:t>
+      </w:r>
+      <w:proofErr w:type="spellEnd"/>
+      <w:r>
+        <w:rPr>
+          <w:rFonts w:ascii="Times New Roman" w:hAnsi="Times New Roman" w:cs="Times New Roman"/>
+          <w:sz w:val="28"/>
+          <w:szCs w:val="28"/>
+        </w:rPr>
+        <w:t xml:space="preserve"> 172.16.8.149 2049` на клиенте не показывала успешного подключения.</w:t>
+      </w:r>
+    </w:p>
+    <w:p>
+      <w:pPr>
+        <w:rPr>
+          <w:rFonts w:ascii="Times New Roman" w:hAnsi="Times New Roman" w:cs="Times New Roman"/>
+          <w:sz w:val="28"/>
+          <w:szCs w:val="28"/>
+        </w:rPr>
+      </w:pPr>
+      <w:r>
+        <w:rPr>
+          <w:rFonts w:ascii="Times New Roman" w:hAnsi="Times New Roman" w:cs="Times New Roman"/>
+          <w:sz w:val="28"/>
+          <w:szCs w:val="28"/>
+        </w:rPr>
+        <w:t>Причина:</w:t>
+      </w:r>
+    </w:p>
+    <w:p>
+      <w:pPr>
+        <w:rPr>
+          <w:rFonts w:ascii="Times New Roman" w:hAnsi="Times New Roman" w:cs="Times New Roman"/>
+          <w:sz w:val="28"/>
+          <w:szCs w:val="28"/>
+        </w:rPr>
+      </w:pPr>
+      <w:r>
+        <w:rPr>
+          <w:rFonts w:ascii="Times New Roman" w:hAnsi="Times New Roman" w:cs="Times New Roman"/>
+          <w:sz w:val="28"/>
+          <w:szCs w:val="28"/>
+        </w:rPr>
         <w:lastRenderedPageBreak/>
-        <w:t xml:space="preserve">Добавление разрешающего правила в iptables на сервере CentOS:  </w:t>
-      </w:r>
-    </w:p>
-    <w:p>
-      <w:pPr>
-        <w:rPr>
-          <w:rFonts w:ascii="Times New Roman" w:hAnsi="Times New Roman" w:cs="Times New Roman"/>
-          <w:sz w:val="28"/>
-          <w:szCs w:val="28"/>
-        </w:rPr>
-      </w:pPr>
-      <w:r>
-        <w:rPr>
-          <w:rFonts w:ascii="Times New Roman" w:hAnsi="Times New Roman" w:cs="Times New Roman"/>
-          <w:sz w:val="28"/>
-          <w:szCs w:val="28"/>
-          <w:lang w:val="en-US"/>
-        </w:rPr>
-        <w:t>`sudo iptables -I INPUT -s 172.16.8.169 -p tcp --dport 2049 -j ACCEPT`</w:t>
-      </w:r>
-    </w:p>
-    <w:p>
-      <w:pPr>
-        <w:rPr>
-          <w:rFonts w:ascii="Times New Roman" w:hAnsi="Times New Roman" w:cs="Times New Roman"/>
-          <w:sz w:val="28"/>
-          <w:szCs w:val="28"/>
-        </w:rPr>
-      </w:pPr>
-      <w:r>
-        <w:rPr>
-          <w:rFonts w:ascii="Times New Roman" w:hAnsi="Times New Roman" w:cs="Times New Roman"/>
-          <w:sz w:val="28"/>
-          <w:szCs w:val="28"/>
-        </w:rPr>
-        <w:t>3. Неправильный порядок правил в iptables</w:t>
+        <w:t xml:space="preserve">Правило `REJECT </w:t>
+      </w:r>
+      <w:proofErr w:type="spellStart"/>
+      <w:r>
+        <w:rPr>
+          <w:rFonts w:ascii="Times New Roman" w:hAnsi="Times New Roman" w:cs="Times New Roman"/>
+          <w:sz w:val="28"/>
+          <w:szCs w:val="28"/>
+        </w:rPr>
+        <w:t>all</w:t>
+      </w:r>
+      <w:proofErr w:type="spellEnd"/>
+      <w:r>
+        <w:rPr>
+          <w:rFonts w:ascii="Times New Roman" w:hAnsi="Times New Roman" w:cs="Times New Roman"/>
+          <w:sz w:val="28"/>
+          <w:szCs w:val="28"/>
+        </w:rPr>
+        <w:t xml:space="preserve">` в </w:t>
+      </w:r>
+      <w:proofErr w:type="spellStart"/>
+      <w:r>
+        <w:rPr>
+          <w:rFonts w:ascii="Times New Roman" w:hAnsi="Times New Roman" w:cs="Times New Roman"/>
+          <w:sz w:val="28"/>
+          <w:szCs w:val="28"/>
+        </w:rPr>
+        <w:t>iptables</w:t>
+      </w:r>
+      <w:proofErr w:type="spellEnd"/>
+      <w:r>
+        <w:rPr>
+          <w:rFonts w:ascii="Times New Roman" w:hAnsi="Times New Roman" w:cs="Times New Roman"/>
+          <w:sz w:val="28"/>
+          <w:szCs w:val="28"/>
+        </w:rPr>
+        <w:t xml:space="preserve"> находилось **выше** добавленного правила `ACCEPT` для порта 2049. Из-за этого пакеты отбрасывались раньше, чем доходили до разрешающего правила.</w:t>
+      </w:r>
+    </w:p>
+    <w:p>
+      <w:pPr>
+        <w:rPr>
+          <w:rFonts w:ascii="Times New Roman" w:hAnsi="Times New Roman" w:cs="Times New Roman"/>
+          <w:sz w:val="28"/>
+          <w:szCs w:val="28"/>
+        </w:rPr>
+      </w:pPr>
+      <w:r>
+        <w:rPr>
+          <w:rFonts w:ascii="Times New Roman" w:hAnsi="Times New Roman" w:cs="Times New Roman"/>
+          <w:sz w:val="28"/>
+          <w:szCs w:val="28"/>
+        </w:rPr>
+        <w:t>Решение:</w:t>
+      </w:r>
+    </w:p>
+    <w:p>
+      <w:pPr>
+        <w:rPr>
+          <w:rFonts w:ascii="Times New Roman" w:hAnsi="Times New Roman" w:cs="Times New Roman"/>
+          <w:sz w:val="28"/>
+          <w:szCs w:val="28"/>
+        </w:rPr>
+      </w:pPr>
+      <w:r>
+        <w:rPr>
+          <w:rFonts w:ascii="Times New Roman" w:hAnsi="Times New Roman" w:cs="Times New Roman"/>
+          <w:sz w:val="28"/>
+          <w:szCs w:val="28"/>
+        </w:rPr>
+        <w:t xml:space="preserve">Удаление старого правила и вставка нового на правильную позицию:  </w:t>
+      </w:r>
+    </w:p>
+    <w:p>
+      <w:pPr>
+        <w:rPr>
+          <w:rFonts w:ascii="Times New Roman" w:hAnsi="Times New Roman" w:cs="Times New Roman"/>
+          <w:sz w:val="28"/>
+          <w:szCs w:val="28"/>
+          <w:lang w:val="en-US"/>
+        </w:rPr>
+      </w:pPr>
+      <w:proofErr w:type="spellStart"/>
+      <w:r>
+        <w:rPr>
+          <w:rFonts w:ascii="Times New Roman" w:hAnsi="Times New Roman" w:cs="Times New Roman"/>
+          <w:sz w:val="28"/>
+          <w:szCs w:val="28"/>
+          <w:lang w:val="en-US"/>
+        </w:rPr>
+        <w:t>sudo</w:t>
+      </w:r>
+      <w:proofErr w:type="spellEnd"/>
+      <w:r>
+        <w:rPr>
+          <w:rFonts w:ascii="Times New Roman" w:hAnsi="Times New Roman" w:cs="Times New Roman"/>
+          <w:sz w:val="28"/>
+          <w:szCs w:val="28"/>
+          <w:lang w:val="en-US"/>
+        </w:rPr>
+        <w:t xml:space="preserve"> iptables -D INPUT 11</w:t>
+      </w:r>
+    </w:p>
+    <w:p>
+      <w:pPr>
+        <w:rPr>
+          <w:rFonts w:ascii="Times New Roman" w:hAnsi="Times New Roman" w:cs="Times New Roman"/>
+          <w:sz w:val="28"/>
+          <w:szCs w:val="28"/>
+          <w:lang w:val="en-US"/>
+        </w:rPr>
+      </w:pPr>
+      <w:proofErr w:type="spellStart"/>
+      <w:r>
+        <w:rPr>
+          <w:rFonts w:ascii="Times New Roman" w:hAnsi="Times New Roman" w:cs="Times New Roman"/>
+          <w:sz w:val="28"/>
+          <w:szCs w:val="28"/>
+          <w:lang w:val="en-US"/>
+        </w:rPr>
+        <w:t>sudo</w:t>
+      </w:r>
+      <w:proofErr w:type="spellEnd"/>
+      <w:r>
+        <w:rPr>
+          <w:rFonts w:ascii="Times New Roman" w:hAnsi="Times New Roman" w:cs="Times New Roman"/>
+          <w:sz w:val="28"/>
+          <w:szCs w:val="28"/>
+          <w:lang w:val="en-US"/>
+        </w:rPr>
+        <w:t xml:space="preserve"> iptables -I INPUT 6 -s 172.16.8.169 -p </w:t>
+      </w:r>
+      <w:proofErr w:type="spellStart"/>
+      <w:r>
+        <w:rPr>
+          <w:rFonts w:ascii="Times New Roman" w:hAnsi="Times New Roman" w:cs="Times New Roman"/>
+          <w:sz w:val="28"/>
+          <w:szCs w:val="28"/>
+          <w:lang w:val="en-US"/>
+        </w:rPr>
+        <w:t>tcp</w:t>
+      </w:r>
+      <w:proofErr w:type="spellEnd"/>
+      <w:r>
+        <w:rPr>
+          <w:rFonts w:ascii="Times New Roman" w:hAnsi="Times New Roman" w:cs="Times New Roman"/>
+          <w:sz w:val="28"/>
+          <w:szCs w:val="28"/>
+          <w:lang w:val="en-US"/>
+        </w:rPr>
+        <w:t xml:space="preserve"> --</w:t>
+      </w:r>
+      <w:proofErr w:type="spellStart"/>
+      <w:r>
+        <w:rPr>
+          <w:rFonts w:ascii="Times New Roman" w:hAnsi="Times New Roman" w:cs="Times New Roman"/>
+          <w:sz w:val="28"/>
+          <w:szCs w:val="28"/>
+          <w:lang w:val="en-US"/>
+        </w:rPr>
+        <w:t>dport</w:t>
+      </w:r>
+      <w:proofErr w:type="spellEnd"/>
+      <w:r>
+        <w:rPr>
+          <w:rFonts w:ascii="Times New Roman" w:hAnsi="Times New Roman" w:cs="Times New Roman"/>
+          <w:sz w:val="28"/>
+          <w:szCs w:val="28"/>
+          <w:lang w:val="en-US"/>
+        </w:rPr>
+        <w:t xml:space="preserve"> 2049 -j ACCEPT</w:t>
+      </w:r>
+    </w:p>
+    <w:p>
+      <w:pPr>
+        <w:rPr>
+          <w:rFonts w:ascii="Times New Roman" w:hAnsi="Times New Roman" w:cs="Times New Roman"/>
+          <w:sz w:val="28"/>
+          <w:szCs w:val="28"/>
+        </w:rPr>
+      </w:pPr>
+      <w:r>
+        <w:rPr>
+          <w:rFonts w:ascii="Times New Roman" w:hAnsi="Times New Roman" w:cs="Times New Roman"/>
+          <w:sz w:val="28"/>
+          <w:szCs w:val="28"/>
+        </w:rPr>
+        <w:t>4. Ошибка `</w:t>
+      </w:r>
+      <w:proofErr w:type="spellStart"/>
+      <w:r>
+        <w:rPr>
+          <w:rFonts w:ascii="Times New Roman" w:hAnsi="Times New Roman" w:cs="Times New Roman"/>
+          <w:sz w:val="28"/>
+          <w:szCs w:val="28"/>
+        </w:rPr>
+        <w:t>Permission</w:t>
+      </w:r>
+      <w:proofErr w:type="spellEnd"/>
+      <w:r>
+        <w:rPr>
+          <w:rFonts w:ascii="Times New Roman" w:hAnsi="Times New Roman" w:cs="Times New Roman"/>
+          <w:sz w:val="28"/>
+          <w:szCs w:val="28"/>
+        </w:rPr>
+        <w:t xml:space="preserve"> </w:t>
+      </w:r>
+      <w:proofErr w:type="spellStart"/>
+      <w:r>
+        <w:rPr>
+          <w:rFonts w:ascii="Times New Roman" w:hAnsi="Times New Roman" w:cs="Times New Roman"/>
+          <w:sz w:val="28"/>
+          <w:szCs w:val="28"/>
+        </w:rPr>
+        <w:t>denied</w:t>
+      </w:r>
+      <w:proofErr w:type="spellEnd"/>
+      <w:r>
+        <w:rPr>
+          <w:rFonts w:ascii="Times New Roman" w:hAnsi="Times New Roman" w:cs="Times New Roman"/>
+          <w:sz w:val="28"/>
+          <w:szCs w:val="28"/>
+        </w:rPr>
+        <w:t>` при записи в экспортированный каталог `</w:t>
+      </w:r>
+      <w:proofErr w:type="spellStart"/>
+      <w:r>
+        <w:rPr>
+          <w:rFonts w:ascii="Times New Roman" w:hAnsi="Times New Roman" w:cs="Times New Roman"/>
+          <w:sz w:val="28"/>
+          <w:szCs w:val="28"/>
+        </w:rPr>
+        <w:t>snmp</w:t>
+      </w:r>
+      <w:proofErr w:type="spellEnd"/>
+      <w:r>
+        <w:rPr>
+          <w:rFonts w:ascii="Times New Roman" w:hAnsi="Times New Roman" w:cs="Times New Roman"/>
+          <w:sz w:val="28"/>
+          <w:szCs w:val="28"/>
+        </w:rPr>
+        <w:t>`</w:t>
       </w:r>
     </w:p>
     <w:p>
@@ -3413,7 +5758,115 @@
           <w:sz w:val="28"/>
           <w:szCs w:val="28"/>
         </w:rPr>
-        <w:t>После добавления правила для порта 2049 соединение по-прежнему не проходило. Команда `nc -zv 172.16.8.149 2049` на клиенте не показывала успешного подключения.</w:t>
+        <w:t>На клиенте Ubuntu при попытке создать файл в смонтированном каталоге `</w:t>
+      </w:r>
+      <w:proofErr w:type="spellStart"/>
+      <w:r>
+        <w:rPr>
+          <w:rFonts w:ascii="Times New Roman" w:hAnsi="Times New Roman" w:cs="Times New Roman"/>
+          <w:sz w:val="28"/>
+          <w:szCs w:val="28"/>
+        </w:rPr>
+        <w:t>snmp</w:t>
+      </w:r>
+      <w:proofErr w:type="spellEnd"/>
+      <w:r>
+        <w:rPr>
+          <w:rFonts w:ascii="Times New Roman" w:hAnsi="Times New Roman" w:cs="Times New Roman"/>
+          <w:sz w:val="28"/>
+          <w:szCs w:val="28"/>
+        </w:rPr>
+        <w:t>` возникала ошибка `</w:t>
+      </w:r>
+      <w:proofErr w:type="spellStart"/>
+      <w:r>
+        <w:rPr>
+          <w:rFonts w:ascii="Times New Roman" w:hAnsi="Times New Roman" w:cs="Times New Roman"/>
+          <w:sz w:val="28"/>
+          <w:szCs w:val="28"/>
+        </w:rPr>
+        <w:t>Permission</w:t>
+      </w:r>
+      <w:proofErr w:type="spellEnd"/>
+      <w:r>
+        <w:rPr>
+          <w:rFonts w:ascii="Times New Roman" w:hAnsi="Times New Roman" w:cs="Times New Roman"/>
+          <w:sz w:val="28"/>
+          <w:szCs w:val="28"/>
+        </w:rPr>
+        <w:t xml:space="preserve"> </w:t>
+      </w:r>
+      <w:proofErr w:type="spellStart"/>
+      <w:r>
+        <w:rPr>
+          <w:rFonts w:ascii="Times New Roman" w:hAnsi="Times New Roman" w:cs="Times New Roman"/>
+          <w:sz w:val="28"/>
+          <w:szCs w:val="28"/>
+        </w:rPr>
+        <w:t>denied</w:t>
+      </w:r>
+      <w:proofErr w:type="spellEnd"/>
+      <w:r>
+        <w:rPr>
+          <w:rFonts w:ascii="Times New Roman" w:hAnsi="Times New Roman" w:cs="Times New Roman"/>
+          <w:sz w:val="28"/>
+          <w:szCs w:val="28"/>
+        </w:rPr>
+        <w:t>`, несмотря на режим `</w:t>
+      </w:r>
+      <w:proofErr w:type="spellStart"/>
+      <w:r>
+        <w:rPr>
+          <w:rFonts w:ascii="Times New Roman" w:hAnsi="Times New Roman" w:cs="Times New Roman"/>
+          <w:sz w:val="28"/>
+          <w:szCs w:val="28"/>
+        </w:rPr>
+        <w:t>rw</w:t>
+      </w:r>
+      <w:proofErr w:type="spellEnd"/>
+      <w:r>
+        <w:rPr>
+          <w:rFonts w:ascii="Times New Roman" w:hAnsi="Times New Roman" w:cs="Times New Roman"/>
+          <w:sz w:val="28"/>
+          <w:szCs w:val="28"/>
+        </w:rPr>
+        <w:t>` в файле `/</w:t>
+      </w:r>
+      <w:proofErr w:type="spellStart"/>
+      <w:r>
+        <w:rPr>
+          <w:rFonts w:ascii="Times New Roman" w:hAnsi="Times New Roman" w:cs="Times New Roman"/>
+          <w:sz w:val="28"/>
+          <w:szCs w:val="28"/>
+        </w:rPr>
+        <w:t>etc</w:t>
+      </w:r>
+      <w:proofErr w:type="spellEnd"/>
+      <w:r>
+        <w:rPr>
+          <w:rFonts w:ascii="Times New Roman" w:hAnsi="Times New Roman" w:cs="Times New Roman"/>
+          <w:sz w:val="28"/>
+          <w:szCs w:val="28"/>
+        </w:rPr>
+        <w:t>/</w:t>
+      </w:r>
+      <w:proofErr w:type="spellStart"/>
+      <w:r>
+        <w:rPr>
+          <w:rFonts w:ascii="Times New Roman" w:hAnsi="Times New Roman" w:cs="Times New Roman"/>
+          <w:sz w:val="28"/>
+          <w:szCs w:val="28"/>
+        </w:rPr>
+        <w:t>exports</w:t>
+      </w:r>
+      <w:proofErr w:type="spellEnd"/>
+      <w:r>
+        <w:rPr>
+          <w:rFonts w:ascii="Times New Roman" w:hAnsi="Times New Roman" w:cs="Times New Roman"/>
+          <w:sz w:val="28"/>
+          <w:szCs w:val="28"/>
+        </w:rPr>
+        <w:t>`.</w:t>
       </w:r>
     </w:p>
     <w:p>
@@ -3447,163 +5900,223 @@
           <w:sz w:val="28"/>
           <w:szCs w:val="28"/>
         </w:rPr>
-        <w:t>Правило `REJECT all` в iptables находилось **выше** добавленного правила `ACCEPT` для порта 2049. Из-за этого пакеты отбрасывались раньше, чем доходили до разрешающего правила.</w:t>
-      </w:r>
-    </w:p>
-    <w:p>
-      <w:pPr>
-        <w:rPr>
-          <w:rFonts w:ascii="Times New Roman" w:hAnsi="Times New Roman" w:cs="Times New Roman"/>
-          <w:sz w:val="28"/>
-          <w:szCs w:val="28"/>
-        </w:rPr>
-      </w:pPr>
-      <w:r>
-        <w:rPr>
-          <w:rFonts w:ascii="Times New Roman" w:hAnsi="Times New Roman" w:cs="Times New Roman"/>
-          <w:sz w:val="28"/>
-          <w:szCs w:val="28"/>
-        </w:rPr>
-        <w:t>Решение:</w:t>
-      </w:r>
-    </w:p>
-    <w:p>
-      <w:pPr>
-        <w:rPr>
-          <w:rFonts w:ascii="Times New Roman" w:hAnsi="Times New Roman" w:cs="Times New Roman"/>
-          <w:sz w:val="28"/>
-          <w:szCs w:val="28"/>
-        </w:rPr>
-      </w:pPr>
-      <w:r>
-        <w:rPr>
-          <w:rFonts w:ascii="Times New Roman" w:hAnsi="Times New Roman" w:cs="Times New Roman"/>
-          <w:sz w:val="28"/>
-          <w:szCs w:val="28"/>
-        </w:rPr>
-        <w:t xml:space="preserve">Удаление старого правила и вставка нового на правильную позицию:  </w:t>
-      </w:r>
-    </w:p>
-    <w:p>
-      <w:pPr>
-        <w:rPr>
-          <w:rFonts w:ascii="Times New Roman" w:hAnsi="Times New Roman" w:cs="Times New Roman"/>
-          <w:sz w:val="28"/>
-          <w:szCs w:val="28"/>
-          <w:lang w:val="en-US"/>
-        </w:rPr>
-      </w:pPr>
-      <w:r>
-        <w:rPr>
-          <w:rFonts w:ascii="Times New Roman" w:hAnsi="Times New Roman" w:cs="Times New Roman"/>
-          <w:sz w:val="28"/>
-          <w:szCs w:val="28"/>
-          <w:lang w:val="en-US"/>
-        </w:rPr>
-        <w:t>sudo iptables -D INPUT 11</w:t>
-      </w:r>
-    </w:p>
-    <w:p>
-      <w:pPr>
-        <w:rPr>
-          <w:rFonts w:ascii="Times New Roman" w:hAnsi="Times New Roman" w:cs="Times New Roman"/>
-          <w:sz w:val="28"/>
-          <w:szCs w:val="28"/>
-        </w:rPr>
-      </w:pPr>
-      <w:r>
-        <w:rPr>
-          <w:rFonts w:ascii="Times New Roman" w:hAnsi="Times New Roman" w:cs="Times New Roman"/>
-          <w:sz w:val="28"/>
-          <w:szCs w:val="28"/>
-          <w:lang w:val="en-US"/>
-        </w:rPr>
-        <w:t>sudo iptables -I INPUT 6 -s 172.16.8.169 -p tcp --dport 2049 -j ACCEPT</w:t>
-      </w:r>
-    </w:p>
-    <w:p>
-      <w:pPr>
-        <w:rPr>
-          <w:rFonts w:ascii="Times New Roman" w:hAnsi="Times New Roman" w:cs="Times New Roman"/>
-          <w:sz w:val="28"/>
-          <w:szCs w:val="28"/>
-        </w:rPr>
-      </w:pPr>
-      <w:r>
-        <w:rPr>
-          <w:rFonts w:ascii="Times New Roman" w:hAnsi="Times New Roman" w:cs="Times New Roman"/>
-          <w:sz w:val="28"/>
-          <w:szCs w:val="28"/>
-        </w:rPr>
-        <w:t>4. Ошибка `Permission denied` при записи в экспортированный каталог `snmp`</w:t>
-      </w:r>
-    </w:p>
-    <w:p>
-      <w:pPr>
-        <w:rPr>
-          <w:rFonts w:ascii="Times New Roman" w:hAnsi="Times New Roman" w:cs="Times New Roman"/>
-          <w:sz w:val="28"/>
-          <w:szCs w:val="28"/>
-        </w:rPr>
-      </w:pPr>
-      <w:r>
-        <w:rPr>
-          <w:rFonts w:ascii="Times New Roman" w:hAnsi="Times New Roman" w:cs="Times New Roman"/>
-          <w:sz w:val="28"/>
-          <w:szCs w:val="28"/>
-        </w:rPr>
-        <w:t xml:space="preserve">Описание: </w:t>
-      </w:r>
-    </w:p>
-    <w:p>
-      <w:pPr>
-        <w:rPr>
-          <w:rFonts w:ascii="Times New Roman" w:hAnsi="Times New Roman" w:cs="Times New Roman"/>
-          <w:sz w:val="28"/>
-          <w:szCs w:val="28"/>
-        </w:rPr>
-      </w:pPr>
-      <w:r>
-        <w:rPr>
-          <w:rFonts w:ascii="Times New Roman" w:hAnsi="Times New Roman" w:cs="Times New Roman"/>
-          <w:sz w:val="28"/>
-          <w:szCs w:val="28"/>
-        </w:rPr>
-        <w:t>На клиенте Ubuntu при попытке создать файл в смонтированном каталоге `snmp` возникала ошибка `Permission denied`, несмотря на режим `rw` в файле `/etc/exports`.</w:t>
-      </w:r>
-    </w:p>
-    <w:p>
-      <w:pPr>
-        <w:rPr>
-          <w:rFonts w:ascii="Times New Roman" w:hAnsi="Times New Roman" w:cs="Times New Roman"/>
-          <w:sz w:val="28"/>
-          <w:szCs w:val="28"/>
-        </w:rPr>
-      </w:pPr>
-      <w:r>
-        <w:rPr>
-          <w:rFonts w:ascii="Times New Roman" w:hAnsi="Times New Roman" w:cs="Times New Roman"/>
-          <w:sz w:val="28"/>
-          <w:szCs w:val="28"/>
-        </w:rPr>
-        <w:t>Причина:</w:t>
-      </w:r>
-    </w:p>
-    <w:p>
-      <w:pPr>
-        <w:rPr>
-          <w:rFonts w:ascii="Times New Roman" w:hAnsi="Times New Roman" w:cs="Times New Roman"/>
-          <w:sz w:val="28"/>
-          <w:szCs w:val="28"/>
-        </w:rPr>
-      </w:pPr>
-      <w:r>
-        <w:rPr>
-          <w:rFonts w:ascii="Times New Roman" w:hAnsi="Times New Roman" w:cs="Times New Roman"/>
-          <w:sz w:val="28"/>
-          <w:szCs w:val="28"/>
-        </w:rPr>
-        <w:t>Каталог `/srv/nfs/snmp` на сервере CentOS (являющийся bind-монтированием `/etc/snmp`) имел права доступа `drwxr-xr-x` (755), что разрешает запись только владельцу (root). Пользователь `tech` на клиенте не имел прав на запись, так как его UID не совпадал с UID root на сервере.</w:t>
+        <w:t>Каталог `/</w:t>
+      </w:r>
+      <w:proofErr w:type="spellStart"/>
+      <w:r>
+        <w:rPr>
+          <w:rFonts w:ascii="Times New Roman" w:hAnsi="Times New Roman" w:cs="Times New Roman"/>
+          <w:sz w:val="28"/>
+          <w:szCs w:val="28"/>
+        </w:rPr>
+        <w:t>srv</w:t>
+      </w:r>
+      <w:proofErr w:type="spellEnd"/>
+      <w:r>
+        <w:rPr>
+          <w:rFonts w:ascii="Times New Roman" w:hAnsi="Times New Roman" w:cs="Times New Roman"/>
+          <w:sz w:val="28"/>
+          <w:szCs w:val="28"/>
+        </w:rPr>
+        <w:t>/</w:t>
+      </w:r>
+      <w:proofErr w:type="spellStart"/>
+      <w:r>
+        <w:rPr>
+          <w:rFonts w:ascii="Times New Roman" w:hAnsi="Times New Roman" w:cs="Times New Roman"/>
+          <w:sz w:val="28"/>
+          <w:szCs w:val="28"/>
+        </w:rPr>
+        <w:t>nfs</w:t>
+      </w:r>
+      <w:proofErr w:type="spellEnd"/>
+      <w:r>
+        <w:rPr>
+          <w:rFonts w:ascii="Times New Roman" w:hAnsi="Times New Roman" w:cs="Times New Roman"/>
+          <w:sz w:val="28"/>
+          <w:szCs w:val="28"/>
+        </w:rPr>
+        <w:t>/</w:t>
+      </w:r>
+      <w:proofErr w:type="spellStart"/>
+      <w:r>
+        <w:rPr>
+          <w:rFonts w:ascii="Times New Roman" w:hAnsi="Times New Roman" w:cs="Times New Roman"/>
+          <w:sz w:val="28"/>
+          <w:szCs w:val="28"/>
+        </w:rPr>
+        <w:t>snmp</w:t>
+      </w:r>
+      <w:proofErr w:type="spellEnd"/>
+      <w:r>
+        <w:rPr>
+          <w:rFonts w:ascii="Times New Roman" w:hAnsi="Times New Roman" w:cs="Times New Roman"/>
+          <w:sz w:val="28"/>
+          <w:szCs w:val="28"/>
+        </w:rPr>
+        <w:t xml:space="preserve">` на сервере </w:t>
+      </w:r>
+      <w:proofErr w:type="spellStart"/>
+      <w:r>
+        <w:rPr>
+          <w:rFonts w:ascii="Times New Roman" w:hAnsi="Times New Roman" w:cs="Times New Roman"/>
+          <w:sz w:val="28"/>
+          <w:szCs w:val="28"/>
+        </w:rPr>
+        <w:t>CentOS</w:t>
+      </w:r>
+      <w:proofErr w:type="spellEnd"/>
+      <w:r>
+        <w:rPr>
+          <w:rFonts w:ascii="Times New Roman" w:hAnsi="Times New Roman" w:cs="Times New Roman"/>
+          <w:sz w:val="28"/>
+          <w:szCs w:val="28"/>
+        </w:rPr>
+        <w:t xml:space="preserve"> (являющийся </w:t>
+      </w:r>
+      <w:proofErr w:type="spellStart"/>
+      <w:r>
+        <w:rPr>
+          <w:rFonts w:ascii="Times New Roman" w:hAnsi="Times New Roman" w:cs="Times New Roman"/>
+          <w:sz w:val="28"/>
+          <w:szCs w:val="28"/>
+        </w:rPr>
+        <w:t>bind</w:t>
+      </w:r>
+      <w:proofErr w:type="spellEnd"/>
+      <w:r>
+        <w:rPr>
+          <w:rFonts w:ascii="Times New Roman" w:hAnsi="Times New Roman" w:cs="Times New Roman"/>
+          <w:sz w:val="28"/>
+          <w:szCs w:val="28"/>
+        </w:rPr>
+        <w:t>-монтированием `/</w:t>
+      </w:r>
+      <w:proofErr w:type="spellStart"/>
+      <w:r>
+        <w:rPr>
+          <w:rFonts w:ascii="Times New Roman" w:hAnsi="Times New Roman" w:cs="Times New Roman"/>
+          <w:sz w:val="28"/>
+          <w:szCs w:val="28"/>
+        </w:rPr>
+        <w:t>etc</w:t>
+      </w:r>
+      <w:proofErr w:type="spellEnd"/>
+      <w:r>
+        <w:rPr>
+          <w:rFonts w:ascii="Times New Roman" w:hAnsi="Times New Roman" w:cs="Times New Roman"/>
+          <w:sz w:val="28"/>
+          <w:szCs w:val="28"/>
+        </w:rPr>
+        <w:t>/</w:t>
+      </w:r>
+      <w:proofErr w:type="spellStart"/>
+      <w:r>
+        <w:rPr>
+          <w:rFonts w:ascii="Times New Roman" w:hAnsi="Times New Roman" w:cs="Times New Roman"/>
+          <w:sz w:val="28"/>
+          <w:szCs w:val="28"/>
+        </w:rPr>
+        <w:t>snmp</w:t>
+      </w:r>
+      <w:proofErr w:type="spellEnd"/>
+      <w:r>
+        <w:rPr>
+          <w:rFonts w:ascii="Times New Roman" w:hAnsi="Times New Roman" w:cs="Times New Roman"/>
+          <w:sz w:val="28"/>
+          <w:szCs w:val="28"/>
+        </w:rPr>
+        <w:t>`) имел права доступа `</w:t>
+      </w:r>
+      <w:proofErr w:type="spellStart"/>
+      <w:r>
+        <w:rPr>
+          <w:rFonts w:ascii="Times New Roman" w:hAnsi="Times New Roman" w:cs="Times New Roman"/>
+          <w:sz w:val="28"/>
+          <w:szCs w:val="28"/>
+        </w:rPr>
+        <w:t>drwxr</w:t>
+      </w:r>
+      <w:proofErr w:type="spellEnd"/>
+      <w:r>
+        <w:rPr>
+          <w:rFonts w:ascii="Times New Roman" w:hAnsi="Times New Roman" w:cs="Times New Roman"/>
+          <w:sz w:val="28"/>
+          <w:szCs w:val="28"/>
+        </w:rPr>
+        <w:t>-</w:t>
+      </w:r>
+      <w:proofErr w:type="spellStart"/>
+      <w:r>
+        <w:rPr>
+          <w:rFonts w:ascii="Times New Roman" w:hAnsi="Times New Roman" w:cs="Times New Roman"/>
+          <w:sz w:val="28"/>
+          <w:szCs w:val="28"/>
+        </w:rPr>
+        <w:t>xr</w:t>
+      </w:r>
+      <w:proofErr w:type="spellEnd"/>
+      <w:r>
+        <w:rPr>
+          <w:rFonts w:ascii="Times New Roman" w:hAnsi="Times New Roman" w:cs="Times New Roman"/>
+          <w:sz w:val="28"/>
+          <w:szCs w:val="28"/>
+        </w:rPr>
+        <w:t>-x` (755), что разрешает запись только владельцу (</w:t>
+      </w:r>
+      <w:proofErr w:type="spellStart"/>
+      <w:r>
+        <w:rPr>
+          <w:rFonts w:ascii="Times New Roman" w:hAnsi="Times New Roman" w:cs="Times New Roman"/>
+          <w:sz w:val="28"/>
+          <w:szCs w:val="28"/>
+        </w:rPr>
+        <w:t>root</w:t>
+      </w:r>
+      <w:proofErr w:type="spellEnd"/>
+      <w:r>
+        <w:rPr>
+          <w:rFonts w:ascii="Times New Roman" w:hAnsi="Times New Roman" w:cs="Times New Roman"/>
+          <w:sz w:val="28"/>
+          <w:szCs w:val="28"/>
+        </w:rPr>
+        <w:t>). Пользователь `</w:t>
+      </w:r>
+      <w:proofErr w:type="spellStart"/>
+      <w:r>
+        <w:rPr>
+          <w:rFonts w:ascii="Times New Roman" w:hAnsi="Times New Roman" w:cs="Times New Roman"/>
+          <w:sz w:val="28"/>
+          <w:szCs w:val="28"/>
+        </w:rPr>
+        <w:t>tech</w:t>
+      </w:r>
+      <w:proofErr w:type="spellEnd"/>
+      <w:r>
+        <w:rPr>
+          <w:rFonts w:ascii="Times New Roman" w:hAnsi="Times New Roman" w:cs="Times New Roman"/>
+          <w:sz w:val="28"/>
+          <w:szCs w:val="28"/>
+        </w:rPr>
+        <w:t xml:space="preserve">` на клиенте не имел прав на запись, так как его UID не совпадал с UID </w:t>
+      </w:r>
+      <w:proofErr w:type="spellStart"/>
+      <w:r>
+        <w:rPr>
+          <w:rFonts w:ascii="Times New Roman" w:hAnsi="Times New Roman" w:cs="Times New Roman"/>
+          <w:sz w:val="28"/>
+          <w:szCs w:val="28"/>
+        </w:rPr>
+        <w:t>root</w:t>
+      </w:r>
+      <w:proofErr w:type="spellEnd"/>
+      <w:r>
+        <w:rPr>
+          <w:rFonts w:ascii="Times New Roman" w:hAnsi="Times New Roman" w:cs="Times New Roman"/>
+          <w:sz w:val="28"/>
+          <w:szCs w:val="28"/>
+        </w:rPr>
+        <w:t xml:space="preserve"> на сервере.</w:t>
       </w:r>
     </w:p>
     <w:p>
@@ -3637,67 +6150,192 @@
           <w:sz w:val="28"/>
           <w:szCs w:val="28"/>
         </w:rPr>
-        <w:t xml:space="preserve">Изменение прав доступа на сервере CentOS:  </w:t>
-      </w:r>
-    </w:p>
-    <w:p>
-      <w:pPr>
-        <w:rPr>
-          <w:rFonts w:ascii="Times New Roman" w:hAnsi="Times New Roman" w:cs="Times New Roman"/>
-          <w:sz w:val="28"/>
-          <w:szCs w:val="28"/>
-          <w:lang w:val="en-US"/>
-        </w:rPr>
-      </w:pPr>
-      <w:r>
-        <w:rPr>
-          <w:rFonts w:ascii="Times New Roman" w:hAnsi="Times New Roman" w:cs="Times New Roman"/>
-          <w:sz w:val="28"/>
-          <w:szCs w:val="28"/>
-          <w:lang w:val="en-US"/>
-        </w:rPr>
-        <w:t>`sudo chmod 777 /srv/nfs/snmp/`</w:t>
-      </w:r>
-    </w:p>
-    <w:p>
-      <w:pPr>
-        <w:rPr>
-          <w:rFonts w:ascii="Times New Roman" w:hAnsi="Times New Roman" w:cs="Times New Roman"/>
-          <w:sz w:val="28"/>
-          <w:szCs w:val="28"/>
-        </w:rPr>
-      </w:pPr>
-    </w:p>
-    <w:p>
-      <w:pPr>
-        <w:rPr>
-          <w:rFonts w:ascii="Times New Roman" w:hAnsi="Times New Roman" w:cs="Times New Roman"/>
-          <w:sz w:val="28"/>
-          <w:szCs w:val="28"/>
-        </w:rPr>
-      </w:pPr>
-    </w:p>
-    <w:p>
-      <w:pPr>
-        <w:rPr>
-          <w:rFonts w:ascii="Times New Roman" w:hAnsi="Times New Roman" w:cs="Times New Roman"/>
-          <w:sz w:val="28"/>
-          <w:szCs w:val="28"/>
-        </w:rPr>
-      </w:pPr>
-    </w:p>
-    <w:p>
-      <w:pPr>
-        <w:rPr>
-          <w:rFonts w:ascii="Times New Roman" w:hAnsi="Times New Roman" w:cs="Times New Roman"/>
-          <w:sz w:val="28"/>
-          <w:szCs w:val="28"/>
+        <w:t xml:space="preserve">Изменение прав доступа на сервере </w:t>
+      </w:r>
+      <w:proofErr w:type="spellStart"/>
+      <w:r>
+        <w:rPr>
+          <w:rFonts w:ascii="Times New Roman" w:hAnsi="Times New Roman" w:cs="Times New Roman"/>
+          <w:sz w:val="28"/>
+          <w:szCs w:val="28"/>
+        </w:rPr>
+        <w:t>CentOS</w:t>
+      </w:r>
+      <w:proofErr w:type="spellEnd"/>
+      <w:r>
+        <w:rPr>
+          <w:rFonts w:ascii="Times New Roman" w:hAnsi="Times New Roman" w:cs="Times New Roman"/>
+          <w:sz w:val="28"/>
+          <w:szCs w:val="28"/>
+        </w:rPr>
+        <w:t xml:space="preserve">:  </w:t>
+      </w:r>
+    </w:p>
+    <w:p>
+      <w:pPr>
+        <w:rPr>
+          <w:rFonts w:ascii="Times New Roman" w:hAnsi="Times New Roman" w:cs="Times New Roman"/>
+          <w:sz w:val="28"/>
+          <w:szCs w:val="28"/>
+          <w:lang w:val="en-US"/>
+        </w:rPr>
+      </w:pPr>
+      <w:r>
+        <w:rPr>
+          <w:rFonts w:ascii="Times New Roman" w:hAnsi="Times New Roman" w:cs="Times New Roman"/>
+          <w:sz w:val="28"/>
+          <w:szCs w:val="28"/>
+          <w:lang w:val="en-US"/>
+        </w:rPr>
+        <w:t>`</w:t>
+      </w:r>
+      <w:proofErr w:type="spellStart"/>
+      <w:r>
+        <w:rPr>
+          <w:rFonts w:ascii="Times New Roman" w:hAnsi="Times New Roman" w:cs="Times New Roman"/>
+          <w:sz w:val="28"/>
+          <w:szCs w:val="28"/>
+          <w:lang w:val="en-US"/>
+        </w:rPr>
+        <w:t>sudo</w:t>
+      </w:r>
+      <w:proofErr w:type="spellEnd"/>
+      <w:r>
+        <w:rPr>
+          <w:rFonts w:ascii="Times New Roman" w:hAnsi="Times New Roman" w:cs="Times New Roman"/>
+          <w:sz w:val="28"/>
+          <w:szCs w:val="28"/>
+          <w:lang w:val="en-US"/>
+        </w:rPr>
+        <w:t xml:space="preserve"> </w:t>
+      </w:r>
+      <w:proofErr w:type="spellStart"/>
+      <w:r>
+        <w:rPr>
+          <w:rFonts w:ascii="Times New Roman" w:hAnsi="Times New Roman" w:cs="Times New Roman"/>
+          <w:sz w:val="28"/>
+          <w:szCs w:val="28"/>
+          <w:lang w:val="en-US"/>
+        </w:rPr>
+        <w:t>chmod</w:t>
+      </w:r>
+      <w:proofErr w:type="spellEnd"/>
+      <w:r>
+        <w:rPr>
+          <w:rFonts w:ascii="Times New Roman" w:hAnsi="Times New Roman" w:cs="Times New Roman"/>
+          <w:sz w:val="28"/>
+          <w:szCs w:val="28"/>
+          <w:lang w:val="en-US"/>
+        </w:rPr>
+        <w:t xml:space="preserve"> 777 /</w:t>
+      </w:r>
+      <w:proofErr w:type="spellStart"/>
+      <w:r>
+        <w:rPr>
+          <w:rFonts w:ascii="Times New Roman" w:hAnsi="Times New Roman" w:cs="Times New Roman"/>
+          <w:sz w:val="28"/>
+          <w:szCs w:val="28"/>
+          <w:lang w:val="en-US"/>
+        </w:rPr>
+        <w:t>srv</w:t>
+      </w:r>
+      <w:proofErr w:type="spellEnd"/>
+      <w:r>
+        <w:rPr>
+          <w:rFonts w:ascii="Times New Roman" w:hAnsi="Times New Roman" w:cs="Times New Roman"/>
+          <w:sz w:val="28"/>
+          <w:szCs w:val="28"/>
+          <w:lang w:val="en-US"/>
+        </w:rPr>
+        <w:t>/</w:t>
+      </w:r>
+      <w:proofErr w:type="spellStart"/>
+      <w:r>
+        <w:rPr>
+          <w:rFonts w:ascii="Times New Roman" w:hAnsi="Times New Roman" w:cs="Times New Roman"/>
+          <w:sz w:val="28"/>
+          <w:szCs w:val="28"/>
+          <w:lang w:val="en-US"/>
+        </w:rPr>
+        <w:t>nfs</w:t>
+      </w:r>
+      <w:proofErr w:type="spellEnd"/>
+      <w:r>
+        <w:rPr>
+          <w:rFonts w:ascii="Times New Roman" w:hAnsi="Times New Roman" w:cs="Times New Roman"/>
+          <w:sz w:val="28"/>
+          <w:szCs w:val="28"/>
+          <w:lang w:val="en-US"/>
+        </w:rPr>
+        <w:t>/</w:t>
+      </w:r>
+      <w:proofErr w:type="spellStart"/>
+      <w:r>
+        <w:rPr>
+          <w:rFonts w:ascii="Times New Roman" w:hAnsi="Times New Roman" w:cs="Times New Roman"/>
+          <w:sz w:val="28"/>
+          <w:szCs w:val="28"/>
+          <w:lang w:val="en-US"/>
+        </w:rPr>
+        <w:t>snmp</w:t>
+      </w:r>
+      <w:proofErr w:type="spellEnd"/>
+      <w:r>
+        <w:rPr>
+          <w:rFonts w:ascii="Times New Roman" w:hAnsi="Times New Roman" w:cs="Times New Roman"/>
+          <w:sz w:val="28"/>
+          <w:szCs w:val="28"/>
+          <w:lang w:val="en-US"/>
+        </w:rPr>
+        <w:t>/`</w:t>
+      </w:r>
+    </w:p>
+    <w:p>
+      <w:pPr>
+        <w:rPr>
+          <w:rFonts w:ascii="Times New Roman" w:hAnsi="Times New Roman" w:cs="Times New Roman"/>
+          <w:sz w:val="28"/>
+          <w:szCs w:val="28"/>
+          <w:lang w:val="en-US"/>
+        </w:rPr>
+      </w:pPr>
+    </w:p>
+    <w:p>
+      <w:pPr>
+        <w:rPr>
+          <w:rFonts w:ascii="Times New Roman" w:hAnsi="Times New Roman" w:cs="Times New Roman"/>
+          <w:sz w:val="28"/>
+          <w:szCs w:val="28"/>
+          <w:lang w:val="en-US"/>
+        </w:rPr>
+      </w:pPr>
+    </w:p>
+    <w:p>
+      <w:pPr>
+        <w:rPr>
+          <w:rFonts w:ascii="Times New Roman" w:hAnsi="Times New Roman" w:cs="Times New Roman"/>
+          <w:sz w:val="28"/>
+          <w:szCs w:val="28"/>
+          <w:lang w:val="en-US"/>
+        </w:rPr>
+      </w:pPr>
+    </w:p>
+    <w:p>
+      <w:pPr>
+        <w:rPr>
+          <w:rFonts w:ascii="Times New Roman" w:hAnsi="Times New Roman" w:cs="Times New Roman"/>
+          <w:sz w:val="28"/>
+          <w:szCs w:val="28"/>
+          <w:lang w:val="en-US"/>
         </w:rPr>
       </w:pPr>
     </w:p>
     <w:p>
       <w:pPr>
         <w:jc w:val="center"/>
+        <w:rPr>
+          <w:lang w:val="en-US"/>
+        </w:rPr>
       </w:pPr>
     </w:p>
     <w:sectPr>
@@ -4723,6 +7361,23 @@
       <w:spacing w:val="5"/>
     </w:rPr>
   </w:style>
+  <w:style w:type="paragraph" w:customStyle="1" w:styleId="Standard">
+    <w:name w:val="Standard"/>
+    <w:qFormat/>
+    <w:rsid w:val="00A4117A"/>
+    <w:pPr>
+      <w:suppressAutoHyphens/>
+      <w:spacing w:after="200" w:line="276" w:lineRule="auto"/>
+      <w:textAlignment w:val="baseline"/>
+    </w:pPr>
+    <w:rPr>
+      <w:rFonts w:ascii="Calibri" w:eastAsia="Calibri" w:hAnsi="Calibri" w:cs="Times New Roman"/>
+      <w:kern w:val="0"/>
+      <w:sz w:val="22"/>
+      <w:szCs w:val="22"/>
+      <w14:ligatures w14:val="none"/>
+    </w:rPr>
+  </w:style>
 </w:styles>
 </file>
 

</xml_diff>